<commit_message>
Add deep statistical analysis and expanded chapter (26 pages)
Co-Authored-By: Claude Opus 5.5 <noreply@anthropic.com>
Claude-Session: https://claude.ai/code/session_01PyretRVkG4y8Ym1e5J23kf
</commit_message>
<xml_diff>
--- a/Book-Chapter-Green-Hydrogen/final/Chapter_GenAI_GA_Green_Hydrogen.docx
+++ b/Book-Chapter-Green-Hydrogen/final/Chapter_GenAI_GA_Green_Hydrogen.docx
@@ -81,7 +81,7 @@
         <w:t xml:space="preserve">Abstract (5 sentences):</w:t>
       </w:r>
       <w:r>
-        <w:t xml:space="preserve"> Sizing solar-powered green hydrogen plants on a single typical weather year hides the bad years that drive storage needs and supply shortfalls. This chapter couples a physics-informed conditional variational autoencoder, trained on open NREL irradiance data, with a genetic algorithm that sizes the PV array, PEM electrolyser, battery and hydrogen tank under risk-neutral and CVaR risk-averse formulations with a reliability chance constraint. The generator produces realistic hourly weather years with multi-day persistence and matches or outperforms Gaussian and bootstrap baselines on probabilistic scores. In semi-arid and humid case studies, scenario-based designs kept 95 % supply reliability in 49–78 % of unseen real-weather years versus 32–42 % for single-year designs, for an LCOH premium of only 1–2.5 %. The chapter closes with practical lessons on validating generative models for storage sizing, arid-site deployment and trustworthy AI in hydrogen infrastructure.</w:t>
+        <w:t xml:space="preserve"> Sizing solar-powered green hydrogen plants on a single typical weather year hides the bad years that drive storage needs and supply shortfalls. This chapter couples a physics-informed conditional variational autoencoder, trained on open NREL irradiance data, with a genetic algorithm that sizes the PV array, PEM electrolyser, battery and hydrogen tank under risk-neutral and CVaR risk-averse formulations with a reliability chance constraint. The generator matches Gaussian and bootstrap baselines on probabilistic scores, is the only well-calibrated one, and alone reproduces the observed multi-day weather persistence. In semi-arid and humid case studies, scenario-based designs kept 95 % supply reliability in 49–78 % of unseen real-weather years versus 32–42 % for single-year designs, for an LCOH premium of only 1–2.5 %. The chapter closes with practical lessons on validating generative models for storage sizing, arid-site deployment and trustworthy AI in hydrogen infrastructure.</w:t>
       </w:r>
     </w:p>
     <w:p>
@@ -95,7 +95,7 @@
     <w:p>
       <w:pPr/>
       <w:r>
-        <w:t xml:space="preserve">Sizing a solar-powered green hydrogen plant on a single typical weather year hides the bad years that drive storage needs and supply shortfalls. This chapter couples generative AI with mathematical optimisation to design for the full range of weather instead. A physics-informed conditional variational autoencoder (CVAE), trained on open NREL irradiance data, generates hourly clearness-index and temperature profiles on a clear-sky envelope, and a latent autoregressive process strings them into synthetic years with realistic multi-day persistence. A real-coded genetic algorithm then sizes PV, PEM electrolyser, battery and hydrogen tank under deterministic, risk-neutral and CVaR risk-averse formulations with a chance constraint on 95 % supply reliability. In a semi-arid and a humid case study, the CVAE matched or outperformed Gaussian and bootstrap baselines, and scenario-based designs kept the reliability target in 49–78 % of unseen real-weather years versus 32–42 % for single-year designs, at an LCOH premium of only 1–2.5 % (7.8–8.1 USD/kg). The chapter closes with lessons on validating generative models for storage sizing, arid-site deployment and trustworthy AI in hydrogen infrastructure.</w:t>
+        <w:t xml:space="preserve">Sizing a solar-powered green hydrogen plant on a single typical weather year hides the bad years that drive storage needs and supply shortfalls. This chapter couples generative AI with mathematical optimisation to design for the full range of weather instead. A physics-informed conditional variational autoencoder (CVAE), trained on open NREL irradiance data, generates hourly clearness-index and temperature profiles on a clear-sky envelope, and a latent autoregressive process strings them into synthetic years with realistic multi-day persistence. A real-coded genetic algorithm then sizes PV, PEM electrolyser, battery and hydrogen tank under deterministic, risk-neutral and CVaR risk-averse formulations with a chance constraint on 95 % supply reliability. In a semi-arid and a humid case study, the CVAE matched Gaussian and bootstrap baselines on probabilistic scores, was the only well-calibrated generator at both sites and the only one to reproduce day-to-day weather persistence, and scenario-based designs kept the reliability target in 49–78 % of unseen real-weather years versus 32–42 % for single-year designs, at an LCOH premium of only 1–2.5 % (7.8–8.1 USD/kg). The chapter closes with lessons on validating generative models for storage sizing, arid-site deployment and trustworthy AI in hydrogen infrastructure.</w:t>
       </w:r>
     </w:p>
     <w:p>
@@ -238,7 +238,7 @@
     <w:p>
       <w:pPr/>
       <w:r>
-        <w:t xml:space="preserve">All code is written from scratch in Python/NumPy and released with the chapter. Section 2 reviews related work; Section 3 models the hydrogen system; Section 4 presents the data and the generative model; Section 5 formulates the optimisation; Section 6 reports results; Section 7 discusses operational trends and challenges; Section 8 concludes.</w:t>
+        <w:t xml:space="preserve">All code is written from scratch in Python/NumPy and released with the chapter. Section 2 reviews related work; Section 3 models the hydrogen system; Section 4 presents the data and the generative model; Section 5 formulates the optimisation; Section 6 reports results; Section 7 gives a deep statistical analysis of the data, the generator and the designs; Section 8 discusses operational trends and challenges; Section 9 concludes.</w:t>
       </w:r>
     </w:p>
     <w:p>
@@ -1571,7 +1571,7 @@
     <w:p>
       <w:pPr/>
       <w:r>
-        <w:t xml:space="preserve">The CVAE matches or beats every baseline on all three scores at both sites, and is the best calibrated: its 90 % intervals cover 88 % and 86 % of held-out days, against 75 % and 85 % for the bootstrap. The margin over the bootstrap is small on the energy score, which is expected — resampling real days is a strong baseline — but the CVAE can also produce days that never occurred and can be steered by its condition.</w:t>
+        <w:t xml:space="preserve">The CVAE has the lowest mean score at both sites, although Section 7.2 shows these differences are not statistically significant; it is clearly the best calibrated: its 90 % intervals cover 88 % and 86 % of held-out days, against 75 % and 85 % for the bootstrap. The margin over the bootstrap is small on the energy score, which is expected — resampling real days is a strong baseline — but the CVAE can also produce days that never occurred and can be steered by its condition.</w:t>
       </w:r>
     </w:p>
     <w:tbl>
@@ -3160,7 +3160,4740 @@
         <w:pStyle w:val="Heading2"/>
       </w:pPr>
       <w:r>
-        <w:t xml:space="preserve">7 Discussion: Operational Trends and Technical Challenges</w:t>
+        <w:t xml:space="preserve">7 Statistical and Deep Analysis</w:t>
+      </w:r>
+    </w:p>
+    <w:p>
+      <w:pPr/>
+      <w:r>
+        <w:t xml:space="preserve">This section asks whether each result in Section 6 survives formal statistical testing, and what drives it. The short answer: the design results are highly significant; the generator's score advantage is not, but its calibration and persistence are.</w:t>
+      </w:r>
+    </w:p>
+    <w:p>
+      <w:pPr>
+        <w:pStyle w:val="Heading3"/>
+      </w:pPr>
+      <w:r>
+        <w:t xml:space="preserve">7.1 Descriptive statistics of the solar resource</w:t>
+      </w:r>
+    </w:p>
+    <w:p>
+      <w:pPr/>
+      <w:r>
+        <w:t xml:space="preserve">The semi-arid site has 12 % more annual insolation but a much harsher season, which is what drives oversizing. Daily insolation is close to symmetric (skewness 0.13 and 0.07) and flat-topped (excess kurtosis −1.08 and −1.11), typical of a bounded variable dominated by the seasonal cycle.</w:t>
+      </w:r>
+    </w:p>
+    <w:tbl>
+      <w:tblPr>
+        <w:tblStyle w:val="TableGrid"/>
+        <w:tblW w:w="0" w:type="auto"/>
+        <w:tblLayout w:type="fixed"/>
+        <w:tblLook w:val="04A0" w:firstRow="1" w:lastRow="0" w:firstColumn="0" w:lastColumn="0" w:noHBand="0" w:noVBand="1"/>
+      </w:tblPr>
+      <w:tblGrid>
+        <w:gridCol w:w="3120"/>
+        <w:gridCol w:w="3120"/>
+        <w:gridCol w:w="3120"/>
+      </w:tblGrid>
+      <w:tr>
+        <w:trPr>
+          <w:tblHeader/>
+        </w:trPr>
+        <w:tc>
+          <w:tcPr>
+            <w:tcW w:w="3120" w:type="dxa"/>
+            <w:shd w:val="clear" w:color="auto" w:fill="F2F2F2"/>
+          </w:tcPr>
+          <w:p>
+            <w:pPr/>
+            <w:r>
+              <w:t xml:space="preserve">Statistic (daily insolation unless stated)</w:t>
+            </w:r>
+          </w:p>
+        </w:tc>
+        <w:tc>
+          <w:tcPr>
+            <w:tcW w:w="3120" w:type="dxa"/>
+            <w:shd w:val="clear" w:color="auto" w:fill="F2F2F2"/>
+          </w:tcPr>
+          <w:p>
+            <w:pPr/>
+            <w:r>
+              <w:t xml:space="preserve">Site A, semi-arid</w:t>
+            </w:r>
+          </w:p>
+        </w:tc>
+        <w:tc>
+          <w:tcPr>
+            <w:tcW w:w="3120" w:type="dxa"/>
+            <w:shd w:val="clear" w:color="auto" w:fill="F2F2F2"/>
+          </w:tcPr>
+          <w:p>
+            <w:pPr/>
+            <w:r>
+              <w:t xml:space="preserve">Site B, humid</w:t>
+            </w:r>
+          </w:p>
+        </w:tc>
+      </w:tr>
+      <w:tr>
+        <w:tc>
+          <w:tcPr>
+            <w:tcW w:w="3120" w:type="dxa"/>
+          </w:tcPr>
+          <w:p>
+            <w:pPr/>
+            <w:r>
+              <w:t xml:space="preserve">Annual GHI (kWh/m²)</w:t>
+            </w:r>
+          </w:p>
+        </w:tc>
+        <w:tc>
+          <w:tcPr>
+            <w:tcW w:w="3120" w:type="dxa"/>
+          </w:tcPr>
+          <w:p>
+            <w:pPr/>
+            <w:r>
+              <w:t xml:space="preserve">1 749</w:t>
+            </w:r>
+          </w:p>
+        </w:tc>
+        <w:tc>
+          <w:tcPr>
+            <w:tcW w:w="3120" w:type="dxa"/>
+          </w:tcPr>
+          <w:p>
+            <w:pPr/>
+            <w:r>
+              <w:t xml:space="preserve">1 566</w:t>
+            </w:r>
+          </w:p>
+        </w:tc>
+      </w:tr>
+      <w:tr>
+        <w:tc>
+          <w:tcPr>
+            <w:tcW w:w="3120" w:type="dxa"/>
+          </w:tcPr>
+          <w:p>
+            <w:pPr/>
+            <w:r>
+              <w:t xml:space="preserve">Mean ± SD (kWh/m²·day)</w:t>
+            </w:r>
+          </w:p>
+        </w:tc>
+        <w:tc>
+          <w:tcPr>
+            <w:tcW w:w="3120" w:type="dxa"/>
+          </w:tcPr>
+          <w:p>
+            <w:pPr/>
+            <w:r>
+              <w:t xml:space="preserve">4.79 ± 2.35</w:t>
+            </w:r>
+          </w:p>
+        </w:tc>
+        <w:tc>
+          <w:tcPr>
+            <w:tcW w:w="3120" w:type="dxa"/>
+          </w:tcPr>
+          <w:p>
+            <w:pPr/>
+            <w:r>
+              <w:t xml:space="preserve">4.29 ± 1.93</w:t>
+            </w:r>
+          </w:p>
+        </w:tc>
+      </w:tr>
+      <w:tr>
+        <w:tc>
+          <w:tcPr>
+            <w:tcW w:w="3120" w:type="dxa"/>
+          </w:tcPr>
+          <w:p>
+            <w:pPr/>
+            <w:r>
+              <w:t xml:space="preserve">Coefficient of variation</w:t>
+            </w:r>
+          </w:p>
+        </w:tc>
+        <w:tc>
+          <w:tcPr>
+            <w:tcW w:w="3120" w:type="dxa"/>
+          </w:tcPr>
+          <w:p>
+            <w:pPr/>
+            <w:r>
+              <w:t xml:space="preserve">0.49</w:t>
+            </w:r>
+          </w:p>
+        </w:tc>
+        <w:tc>
+          <w:tcPr>
+            <w:tcW w:w="3120" w:type="dxa"/>
+          </w:tcPr>
+          <w:p>
+            <w:pPr/>
+            <w:r>
+              <w:t xml:space="preserve">0.45</w:t>
+            </w:r>
+          </w:p>
+        </w:tc>
+      </w:tr>
+      <w:tr>
+        <w:tc>
+          <w:tcPr>
+            <w:tcW w:w="3120" w:type="dxa"/>
+          </w:tcPr>
+          <w:p>
+            <w:pPr/>
+            <w:r>
+              <w:t xml:space="preserve">Min – max (kWh/m²·day)</w:t>
+            </w:r>
+          </w:p>
+        </w:tc>
+        <w:tc>
+          <w:tcPr>
+            <w:tcW w:w="3120" w:type="dxa"/>
+          </w:tcPr>
+          <w:p>
+            <w:pPr/>
+            <w:r>
+              <w:t xml:space="preserve">0.52 – 9.34</w:t>
+            </w:r>
+          </w:p>
+        </w:tc>
+        <w:tc>
+          <w:tcPr>
+            <w:tcW w:w="3120" w:type="dxa"/>
+          </w:tcPr>
+          <w:p>
+            <w:pPr/>
+            <w:r>
+              <w:t xml:space="preserve">0.69 – 7.95</w:t>
+            </w:r>
+          </w:p>
+        </w:tc>
+      </w:tr>
+      <w:tr>
+        <w:tc>
+          <w:tcPr>
+            <w:tcW w:w="3120" w:type="dxa"/>
+          </w:tcPr>
+          <w:p>
+            <w:pPr/>
+            <w:r>
+              <w:t xml:space="preserve">Skewness / excess kurtosis</w:t>
+            </w:r>
+          </w:p>
+        </w:tc>
+        <w:tc>
+          <w:tcPr>
+            <w:tcW w:w="3120" w:type="dxa"/>
+          </w:tcPr>
+          <w:p>
+            <w:pPr/>
+            <w:r>
+              <w:t xml:space="preserve">0.13 / −1.08</w:t>
+            </w:r>
+          </w:p>
+        </w:tc>
+        <w:tc>
+          <w:tcPr>
+            <w:tcW w:w="3120" w:type="dxa"/>
+          </w:tcPr>
+          <w:p>
+            <w:pPr/>
+            <w:r>
+              <w:t xml:space="preserve">0.07 / −1.11</w:t>
+            </w:r>
+          </w:p>
+        </w:tc>
+      </w:tr>
+      <w:tr>
+        <w:tc>
+          <w:tcPr>
+            <w:tcW w:w="3120" w:type="dxa"/>
+          </w:tcPr>
+          <w:p>
+            <w:pPr/>
+            <w:r>
+              <w:t xml:space="preserve">Mean daily clearness (G/G_cs)</w:t>
+            </w:r>
+          </w:p>
+        </w:tc>
+        <w:tc>
+          <w:tcPr>
+            <w:tcW w:w="3120" w:type="dxa"/>
+          </w:tcPr>
+          <w:p>
+            <w:pPr/>
+            <w:r>
+              <w:t xml:space="preserve">0.76</w:t>
+            </w:r>
+          </w:p>
+        </w:tc>
+        <w:tc>
+          <w:tcPr>
+            <w:tcW w:w="3120" w:type="dxa"/>
+          </w:tcPr>
+          <w:p>
+            <w:pPr/>
+            <w:r>
+              <w:t xml:space="preserve">0.76</w:t>
+            </w:r>
+          </w:p>
+        </w:tc>
+      </w:tr>
+      <w:tr>
+        <w:tc>
+          <w:tcPr>
+            <w:tcW w:w="3120" w:type="dxa"/>
+          </w:tcPr>
+          <w:p>
+            <w:pPr/>
+            <w:r>
+              <w:t xml:space="preserve">Clear days (≥ 0.7) / overcast days (&lt; 0.4)</w:t>
+            </w:r>
+          </w:p>
+        </w:tc>
+        <w:tc>
+          <w:tcPr>
+            <w:tcW w:w="3120" w:type="dxa"/>
+          </w:tcPr>
+          <w:p>
+            <w:pPr/>
+            <w:r>
+              <w:t xml:space="preserve">242 / 32</w:t>
+            </w:r>
+          </w:p>
+        </w:tc>
+        <w:tc>
+          <w:tcPr>
+            <w:tcW w:w="3120" w:type="dxa"/>
+          </w:tcPr>
+          <w:p>
+            <w:pPr/>
+            <w:r>
+              <w:t xml:space="preserve">233 / 32</w:t>
+            </w:r>
+          </w:p>
+        </w:tc>
+      </w:tr>
+      <w:tr>
+        <w:tc>
+          <w:tcPr>
+            <w:tcW w:w="3120" w:type="dxa"/>
+          </w:tcPr>
+          <w:p>
+            <w:pPr/>
+            <w:r>
+              <w:t xml:space="preserve">Lag-1 autocorrelation of deseasonalised daily insolation</w:t>
+            </w:r>
+          </w:p>
+        </w:tc>
+        <w:tc>
+          <w:tcPr>
+            <w:tcW w:w="3120" w:type="dxa"/>
+          </w:tcPr>
+          <w:p>
+            <w:pPr/>
+            <w:r>
+              <w:t xml:space="preserve">0.28</w:t>
+            </w:r>
+          </w:p>
+        </w:tc>
+        <w:tc>
+          <w:tcPr>
+            <w:tcW w:w="3120" w:type="dxa"/>
+          </w:tcPr>
+          <w:p>
+            <w:pPr/>
+            <w:r>
+              <w:t xml:space="preserve">0.25</w:t>
+            </w:r>
+          </w:p>
+        </w:tc>
+      </w:tr>
+      <w:tr>
+        <w:tc>
+          <w:tcPr>
+            <w:tcW w:w="3120" w:type="dxa"/>
+          </w:tcPr>
+          <w:p>
+            <w:pPr/>
+            <w:r>
+              <w:t xml:space="preserve">Air temperature mean (min – max), °C</w:t>
+            </w:r>
+          </w:p>
+        </w:tc>
+        <w:tc>
+          <w:tcPr>
+            <w:tcW w:w="3120" w:type="dxa"/>
+          </w:tcPr>
+          <w:p>
+            <w:pPr/>
+            <w:r>
+              <w:t xml:space="preserve">8.1 (−27.7 – 34.9)</w:t>
+            </w:r>
+          </w:p>
+        </w:tc>
+        <w:tc>
+          <w:tcPr>
+            <w:tcW w:w="3120" w:type="dxa"/>
+          </w:tcPr>
+          <w:p>
+            <w:pPr/>
+            <w:r>
+              <w:t xml:space="preserve">14.4 (−16.7 – 35.6)</w:t>
+            </w:r>
+          </w:p>
+        </w:tc>
+      </w:tr>
+      <w:tr>
+        <w:tc>
+          <w:tcPr>
+            <w:tcW w:w="3120" w:type="dxa"/>
+          </w:tcPr>
+          <w:p>
+            <w:pPr/>
+            <w:r>
+              <w:t xml:space="preserve">Correlation of insolation and temperature anomalies</w:t>
+            </w:r>
+          </w:p>
+        </w:tc>
+        <w:tc>
+          <w:tcPr>
+            <w:tcW w:w="3120" w:type="dxa"/>
+          </w:tcPr>
+          <w:p>
+            <w:pPr/>
+            <w:r>
+              <w:t xml:space="preserve">0.28</w:t>
+            </w:r>
+          </w:p>
+        </w:tc>
+        <w:tc>
+          <w:tcPr>
+            <w:tcW w:w="3120" w:type="dxa"/>
+          </w:tcPr>
+          <w:p>
+            <w:pPr/>
+            <w:r>
+              <w:t xml:space="preserve">0.11</w:t>
+            </w:r>
+          </w:p>
+        </w:tc>
+      </w:tr>
+    </w:tbl>
+    <w:p>
+      <w:pPr/>
+      <w:r>
+        <w:t xml:space="preserve">Deseasonalisation subtracts a 31-day centred moving average. The positive lag-1 autocorrelation (0.25–0.28) is the statistical signature of multi-day weather persistence that a storage design must survive.</w:t>
+      </w:r>
+    </w:p>
+    <w:p>
+      <w:pPr/>
+      <w:r>
+        <w:drawing>
+          <wp:inline distT="0" distB="0" distL="0" distR="0">
+            <wp:extent cx="5486400" cy="2506435"/>
+            <wp:docPr id="5" name="image5" descr="Fig. 5 · results/analysis_monthly.csv · month ≈ 365/12 days"/>
+            <a:graphic xmlns:a="http://schemas.openxmlformats.org/drawingml/2006/main">
+              <a:graphicData uri="http://schemas.openxmlformats.org/drawingml/2006/picture">
+                <pic:pic xmlns:pic="http://schemas.openxmlformats.org/drawingml/2006/picture">
+                  <pic:nvPicPr>
+                    <pic:cNvPr id="5" name="image5" descr="Fig. 5 · results/analysis_monthly.csv · month ≈ 365/12 days"/>
+                    <pic:cNvPicPr/>
+                  </pic:nvPicPr>
+                  <pic:blipFill>
+                    <a:blip r:embed="rId7"/>
+                    <a:stretch>
+                      <a:fillRect/>
+                    </a:stretch>
+                  </pic:blipFill>
+                  <pic:spPr>
+                    <a:xfrm>
+                      <a:off x="0" y="0"/>
+                      <a:ext cx="5486400" cy="2506435"/>
+                    </a:xfrm>
+                    <a:prstGeom prst="rect">
+                      <a:avLst/>
+                    </a:prstGeom>
+                  </pic:spPr>
+                </pic:pic>
+              </a:graphicData>
+            </a:graphic>
+          </wp:inline>
+        </w:drawing>
+      </w:r>
+    </w:p>
+    <w:p>
+      <w:pPr/>
+      <w:r>
+        <w:t xml:space="preserve">Fig. 5 · results/analysis_monthly.csv · month ≈ 365/12 days</w:t>
+      </w:r>
+    </w:p>
+    <w:p>
+      <w:pPr/>
+      <w:r>
+        <w:t xml:space="preserve">At site A, January delivers only a fifth of June's insolation, so a plant sized for a constant demand must carry large surplus capacity through summer — the root of its 32 % curtailment.</w:t>
+      </w:r>
+    </w:p>
+    <w:p>
+      <w:pPr>
+        <w:pStyle w:val="Heading3"/>
+      </w:pPr>
+      <w:r>
+        <w:t xml:space="preserve">7.2 Hypothesis tests on the scenario generator</w:t>
+      </w:r>
+    </w:p>
+    <w:p>
+      <w:pPr/>
+      <w:r>
+        <w:t xml:space="preserve">The CVAE's lower mean scores in Table 6.1 are not statistically significant, but its calibration is: it is the only method whose probability integral transform (PIT) is consistent with uniformity at both sites.</w:t>
+      </w:r>
+    </w:p>
+    <w:p>
+      <w:pPr/>
+      <w:r>
+        <w:rPr>
+          <w:b/>
+        </w:rPr>
+        <w:t xml:space="preserve">Paired score differences.</w:t>
+      </w:r>
+      <w:r>
+        <w:t xml:space="preserve"> For each of the 73 held-out days per site, the per-day score of the CVAE was paired with that of each baseline. The table reports the mean difference (negative favours the CVAE), a 95 % percentile bootstrap interval (5 000 resamples of days), and the two-sided Wilcoxon signed-rank p-value.</w:t>
+      </w:r>
+    </w:p>
+    <w:tbl>
+      <w:tblPr>
+        <w:tblStyle w:val="TableGrid"/>
+        <w:tblW w:w="0" w:type="auto"/>
+        <w:tblLayout w:type="fixed"/>
+        <w:tblLook w:val="04A0" w:firstRow="1" w:lastRow="0" w:firstColumn="0" w:lastColumn="0" w:noHBand="0" w:noVBand="1"/>
+      </w:tblPr>
+      <w:tblGrid>
+        <w:gridCol w:w="1337"/>
+        <w:gridCol w:w="1337"/>
+        <w:gridCol w:w="1337"/>
+        <w:gridCol w:w="1337"/>
+        <w:gridCol w:w="1337"/>
+        <w:gridCol w:w="1337"/>
+        <w:gridCol w:w="1337"/>
+      </w:tblGrid>
+      <w:tr>
+        <w:trPr>
+          <w:tblHeader/>
+        </w:trPr>
+        <w:tc>
+          <w:tcPr>
+            <w:tcW w:w="1337" w:type="dxa"/>
+            <w:shd w:val="clear" w:color="auto" w:fill="F2F2F2"/>
+          </w:tcPr>
+          <w:p>
+            <w:pPr/>
+            <w:r>
+              <w:t xml:space="preserve">Site</w:t>
+            </w:r>
+          </w:p>
+        </w:tc>
+        <w:tc>
+          <w:tcPr>
+            <w:tcW w:w="1337" w:type="dxa"/>
+            <w:shd w:val="clear" w:color="auto" w:fill="F2F2F2"/>
+          </w:tcPr>
+          <w:p>
+            <w:pPr/>
+            <w:r>
+              <w:t xml:space="preserve">Comparison</w:t>
+            </w:r>
+          </w:p>
+        </w:tc>
+        <w:tc>
+          <w:tcPr>
+            <w:tcW w:w="1337" w:type="dxa"/>
+            <w:shd w:val="clear" w:color="auto" w:fill="F2F2F2"/>
+          </w:tcPr>
+          <w:p>
+            <w:pPr/>
+            <w:r>
+              <w:t xml:space="preserve">Score</w:t>
+            </w:r>
+          </w:p>
+        </w:tc>
+        <w:tc>
+          <w:tcPr>
+            <w:tcW w:w="1337" w:type="dxa"/>
+            <w:shd w:val="clear" w:color="auto" w:fill="F2F2F2"/>
+          </w:tcPr>
+          <w:p>
+            <w:pPr/>
+            <w:r>
+              <w:t xml:space="preserve">Mean difference</w:t>
+            </w:r>
+          </w:p>
+        </w:tc>
+        <w:tc>
+          <w:tcPr>
+            <w:tcW w:w="1337" w:type="dxa"/>
+            <w:shd w:val="clear" w:color="auto" w:fill="F2F2F2"/>
+          </w:tcPr>
+          <w:p>
+            <w:pPr/>
+            <w:r>
+              <w:t xml:space="preserve">95 % bootstrap CI</w:t>
+            </w:r>
+          </w:p>
+        </w:tc>
+        <w:tc>
+          <w:tcPr>
+            <w:tcW w:w="1337" w:type="dxa"/>
+            <w:shd w:val="clear" w:color="auto" w:fill="F2F2F2"/>
+          </w:tcPr>
+          <w:p>
+            <w:pPr/>
+            <w:r>
+              <w:t xml:space="preserve">Wilcoxon p</w:t>
+            </w:r>
+          </w:p>
+        </w:tc>
+        <w:tc>
+          <w:tcPr>
+            <w:tcW w:w="1337" w:type="dxa"/>
+            <w:shd w:val="clear" w:color="auto" w:fill="F2F2F2"/>
+          </w:tcPr>
+          <w:p>
+            <w:pPr/>
+            <w:r>
+              <w:t xml:space="preserve">Days CVAE better</w:t>
+            </w:r>
+          </w:p>
+        </w:tc>
+      </w:tr>
+      <w:tr>
+        <w:tc>
+          <w:tcPr>
+            <w:tcW w:w="1337" w:type="dxa"/>
+          </w:tcPr>
+          <w:p>
+            <w:pPr/>
+            <w:r>
+              <w:t xml:space="preserve">A</w:t>
+            </w:r>
+          </w:p>
+        </w:tc>
+        <w:tc>
+          <w:tcPr>
+            <w:tcW w:w="1337" w:type="dxa"/>
+          </w:tcPr>
+          <w:p>
+            <w:pPr/>
+            <w:r>
+              <w:t xml:space="preserve">CVAE − Gaussian</w:t>
+            </w:r>
+          </w:p>
+        </w:tc>
+        <w:tc>
+          <w:tcPr>
+            <w:tcW w:w="1337" w:type="dxa"/>
+          </w:tcPr>
+          <w:p>
+            <w:pPr/>
+            <w:r>
+              <w:t xml:space="preserve">Energy score</w:t>
+            </w:r>
+          </w:p>
+        </w:tc>
+        <w:tc>
+          <w:tcPr>
+            <w:tcW w:w="1337" w:type="dxa"/>
+          </w:tcPr>
+          <w:p>
+            <w:pPr/>
+            <w:r>
+              <w:t xml:space="preserve">−0.002</w:t>
+            </w:r>
+          </w:p>
+        </w:tc>
+        <w:tc>
+          <w:tcPr>
+            <w:tcW w:w="1337" w:type="dxa"/>
+          </w:tcPr>
+          <w:p>
+            <w:pPr/>
+            <w:r>
+              <w:t xml:space="preserve">[−0.023, 0.020]</w:t>
+            </w:r>
+          </w:p>
+        </w:tc>
+        <w:tc>
+          <w:tcPr>
+            <w:tcW w:w="1337" w:type="dxa"/>
+          </w:tcPr>
+          <w:p>
+            <w:pPr/>
+            <w:r>
+              <w:t xml:space="preserve">0.72</w:t>
+            </w:r>
+          </w:p>
+        </w:tc>
+        <w:tc>
+          <w:tcPr>
+            <w:tcW w:w="1337" w:type="dxa"/>
+          </w:tcPr>
+          <w:p>
+            <w:pPr/>
+            <w:r>
+              <w:t xml:space="preserve">37 / 73</w:t>
+            </w:r>
+          </w:p>
+        </w:tc>
+      </w:tr>
+      <w:tr>
+        <w:tc>
+          <w:tcPr>
+            <w:tcW w:w="1337" w:type="dxa"/>
+          </w:tcPr>
+          <w:p>
+            <w:pPr/>
+            <w:r>
+              <w:t xml:space="preserve">A</w:t>
+            </w:r>
+          </w:p>
+        </w:tc>
+        <w:tc>
+          <w:tcPr>
+            <w:tcW w:w="1337" w:type="dxa"/>
+          </w:tcPr>
+          <w:p>
+            <w:pPr/>
+            <w:r>
+              <w:t xml:space="preserve">CVAE − Gaussian</w:t>
+            </w:r>
+          </w:p>
+        </w:tc>
+        <w:tc>
+          <w:tcPr>
+            <w:tcW w:w="1337" w:type="dxa"/>
+          </w:tcPr>
+          <w:p>
+            <w:pPr/>
+            <w:r>
+              <w:t xml:space="preserve">CRPS</w:t>
+            </w:r>
+          </w:p>
+        </w:tc>
+        <w:tc>
+          <w:tcPr>
+            <w:tcW w:w="1337" w:type="dxa"/>
+          </w:tcPr>
+          <w:p>
+            <w:pPr/>
+            <w:r>
+              <w:t xml:space="preserve">−0.035</w:t>
+            </w:r>
+          </w:p>
+        </w:tc>
+        <w:tc>
+          <w:tcPr>
+            <w:tcW w:w="1337" w:type="dxa"/>
+          </w:tcPr>
+          <w:p>
+            <w:pPr/>
+            <w:r>
+              <w:t xml:space="preserve">[−0.111, 0.038]</w:t>
+            </w:r>
+          </w:p>
+        </w:tc>
+        <w:tc>
+          <w:tcPr>
+            <w:tcW w:w="1337" w:type="dxa"/>
+          </w:tcPr>
+          <w:p>
+            <w:pPr/>
+            <w:r>
+              <w:t xml:space="preserve">0.45</w:t>
+            </w:r>
+          </w:p>
+        </w:tc>
+        <w:tc>
+          <w:tcPr>
+            <w:tcW w:w="1337" w:type="dxa"/>
+          </w:tcPr>
+          <w:p>
+            <w:pPr/>
+            <w:r>
+              <w:t xml:space="preserve">38 / 73</w:t>
+            </w:r>
+          </w:p>
+        </w:tc>
+      </w:tr>
+      <w:tr>
+        <w:tc>
+          <w:tcPr>
+            <w:tcW w:w="1337" w:type="dxa"/>
+          </w:tcPr>
+          <w:p>
+            <w:pPr/>
+            <w:r>
+              <w:t xml:space="preserve">A</w:t>
+            </w:r>
+          </w:p>
+        </w:tc>
+        <w:tc>
+          <w:tcPr>
+            <w:tcW w:w="1337" w:type="dxa"/>
+          </w:tcPr>
+          <w:p>
+            <w:pPr/>
+            <w:r>
+              <w:t xml:space="preserve">CVAE − Bootstrap</w:t>
+            </w:r>
+          </w:p>
+        </w:tc>
+        <w:tc>
+          <w:tcPr>
+            <w:tcW w:w="1337" w:type="dxa"/>
+          </w:tcPr>
+          <w:p>
+            <w:pPr/>
+            <w:r>
+              <w:t xml:space="preserve">Energy score</w:t>
+            </w:r>
+          </w:p>
+        </w:tc>
+        <w:tc>
+          <w:tcPr>
+            <w:tcW w:w="1337" w:type="dxa"/>
+          </w:tcPr>
+          <w:p>
+            <w:pPr/>
+            <w:r>
+              <w:t xml:space="preserve">−0.001</w:t>
+            </w:r>
+          </w:p>
+        </w:tc>
+        <w:tc>
+          <w:tcPr>
+            <w:tcW w:w="1337" w:type="dxa"/>
+          </w:tcPr>
+          <w:p>
+            <w:pPr/>
+            <w:r>
+              <w:t xml:space="preserve">[−0.019, 0.018]</w:t>
+            </w:r>
+          </w:p>
+        </w:tc>
+        <w:tc>
+          <w:tcPr>
+            <w:tcW w:w="1337" w:type="dxa"/>
+          </w:tcPr>
+          <w:p>
+            <w:pPr/>
+            <w:r>
+              <w:t xml:space="preserve">0.94</w:t>
+            </w:r>
+          </w:p>
+        </w:tc>
+        <w:tc>
+          <w:tcPr>
+            <w:tcW w:w="1337" w:type="dxa"/>
+          </w:tcPr>
+          <w:p>
+            <w:pPr/>
+            <w:r>
+              <w:t xml:space="preserve">36 / 73</w:t>
+            </w:r>
+          </w:p>
+        </w:tc>
+      </w:tr>
+      <w:tr>
+        <w:tc>
+          <w:tcPr>
+            <w:tcW w:w="1337" w:type="dxa"/>
+          </w:tcPr>
+          <w:p>
+            <w:pPr/>
+            <w:r>
+              <w:t xml:space="preserve">A</w:t>
+            </w:r>
+          </w:p>
+        </w:tc>
+        <w:tc>
+          <w:tcPr>
+            <w:tcW w:w="1337" w:type="dxa"/>
+          </w:tcPr>
+          <w:p>
+            <w:pPr/>
+            <w:r>
+              <w:t xml:space="preserve">CVAE − Bootstrap</w:t>
+            </w:r>
+          </w:p>
+        </w:tc>
+        <w:tc>
+          <w:tcPr>
+            <w:tcW w:w="1337" w:type="dxa"/>
+          </w:tcPr>
+          <w:p>
+            <w:pPr/>
+            <w:r>
+              <w:t xml:space="preserve">CRPS</w:t>
+            </w:r>
+          </w:p>
+        </w:tc>
+        <w:tc>
+          <w:tcPr>
+            <w:tcW w:w="1337" w:type="dxa"/>
+          </w:tcPr>
+          <w:p>
+            <w:pPr/>
+            <w:r>
+              <w:t xml:space="preserve">−0.030</w:t>
+            </w:r>
+          </w:p>
+        </w:tc>
+        <w:tc>
+          <w:tcPr>
+            <w:tcW w:w="1337" w:type="dxa"/>
+          </w:tcPr>
+          <w:p>
+            <w:pPr/>
+            <w:r>
+              <w:t xml:space="preserve">[−0.095, 0.035]</w:t>
+            </w:r>
+          </w:p>
+        </w:tc>
+        <w:tc>
+          <w:tcPr>
+            <w:tcW w:w="1337" w:type="dxa"/>
+          </w:tcPr>
+          <w:p>
+            <w:pPr/>
+            <w:r>
+              <w:t xml:space="preserve">0.60</w:t>
+            </w:r>
+          </w:p>
+        </w:tc>
+        <w:tc>
+          <w:tcPr>
+            <w:tcW w:w="1337" w:type="dxa"/>
+          </w:tcPr>
+          <w:p>
+            <w:pPr/>
+            <w:r>
+              <w:t xml:space="preserve">31 / 73</w:t>
+            </w:r>
+          </w:p>
+        </w:tc>
+      </w:tr>
+      <w:tr>
+        <w:tc>
+          <w:tcPr>
+            <w:tcW w:w="1337" w:type="dxa"/>
+          </w:tcPr>
+          <w:p>
+            <w:pPr/>
+            <w:r>
+              <w:t xml:space="preserve">B</w:t>
+            </w:r>
+          </w:p>
+        </w:tc>
+        <w:tc>
+          <w:tcPr>
+            <w:tcW w:w="1337" w:type="dxa"/>
+          </w:tcPr>
+          <w:p>
+            <w:pPr/>
+            <w:r>
+              <w:t xml:space="preserve">CVAE − Gaussian</w:t>
+            </w:r>
+          </w:p>
+        </w:tc>
+        <w:tc>
+          <w:tcPr>
+            <w:tcW w:w="1337" w:type="dxa"/>
+          </w:tcPr>
+          <w:p>
+            <w:pPr/>
+            <w:r>
+              <w:t xml:space="preserve">Energy score</w:t>
+            </w:r>
+          </w:p>
+        </w:tc>
+        <w:tc>
+          <w:tcPr>
+            <w:tcW w:w="1337" w:type="dxa"/>
+          </w:tcPr>
+          <w:p>
+            <w:pPr/>
+            <w:r>
+              <w:t xml:space="preserve">−0.007</w:t>
+            </w:r>
+          </w:p>
+        </w:tc>
+        <w:tc>
+          <w:tcPr>
+            <w:tcW w:w="1337" w:type="dxa"/>
+          </w:tcPr>
+          <w:p>
+            <w:pPr/>
+            <w:r>
+              <w:t xml:space="preserve">[−0.023, 0.009]</w:t>
+            </w:r>
+          </w:p>
+        </w:tc>
+        <w:tc>
+          <w:tcPr>
+            <w:tcW w:w="1337" w:type="dxa"/>
+          </w:tcPr>
+          <w:p>
+            <w:pPr/>
+            <w:r>
+              <w:t xml:space="preserve">0.21</w:t>
+            </w:r>
+          </w:p>
+        </w:tc>
+        <w:tc>
+          <w:tcPr>
+            <w:tcW w:w="1337" w:type="dxa"/>
+          </w:tcPr>
+          <w:p>
+            <w:pPr/>
+            <w:r>
+              <w:t xml:space="preserve">40 / 73</w:t>
+            </w:r>
+          </w:p>
+        </w:tc>
+      </w:tr>
+      <w:tr>
+        <w:tc>
+          <w:tcPr>
+            <w:tcW w:w="1337" w:type="dxa"/>
+          </w:tcPr>
+          <w:p>
+            <w:pPr/>
+            <w:r>
+              <w:t xml:space="preserve">B</w:t>
+            </w:r>
+          </w:p>
+        </w:tc>
+        <w:tc>
+          <w:tcPr>
+            <w:tcW w:w="1337" w:type="dxa"/>
+          </w:tcPr>
+          <w:p>
+            <w:pPr/>
+            <w:r>
+              <w:t xml:space="preserve">CVAE − Gaussian</w:t>
+            </w:r>
+          </w:p>
+        </w:tc>
+        <w:tc>
+          <w:tcPr>
+            <w:tcW w:w="1337" w:type="dxa"/>
+          </w:tcPr>
+          <w:p>
+            <w:pPr/>
+            <w:r>
+              <w:t xml:space="preserve">CRPS</w:t>
+            </w:r>
+          </w:p>
+        </w:tc>
+        <w:tc>
+          <w:tcPr>
+            <w:tcW w:w="1337" w:type="dxa"/>
+          </w:tcPr>
+          <w:p>
+            <w:pPr/>
+            <w:r>
+              <w:t xml:space="preserve">−0.022</w:t>
+            </w:r>
+          </w:p>
+        </w:tc>
+        <w:tc>
+          <w:tcPr>
+            <w:tcW w:w="1337" w:type="dxa"/>
+          </w:tcPr>
+          <w:p>
+            <w:pPr/>
+            <w:r>
+              <w:t xml:space="preserve">[−0.077, 0.036]</w:t>
+            </w:r>
+          </w:p>
+        </w:tc>
+        <w:tc>
+          <w:tcPr>
+            <w:tcW w:w="1337" w:type="dxa"/>
+          </w:tcPr>
+          <w:p>
+            <w:pPr/>
+            <w:r>
+              <w:t xml:space="preserve">0.17</w:t>
+            </w:r>
+          </w:p>
+        </w:tc>
+        <w:tc>
+          <w:tcPr>
+            <w:tcW w:w="1337" w:type="dxa"/>
+          </w:tcPr>
+          <w:p>
+            <w:pPr/>
+            <w:r>
+              <w:t xml:space="preserve">43 / 73</w:t>
+            </w:r>
+          </w:p>
+        </w:tc>
+      </w:tr>
+      <w:tr>
+        <w:tc>
+          <w:tcPr>
+            <w:tcW w:w="1337" w:type="dxa"/>
+          </w:tcPr>
+          <w:p>
+            <w:pPr/>
+            <w:r>
+              <w:t xml:space="preserve">B</w:t>
+            </w:r>
+          </w:p>
+        </w:tc>
+        <w:tc>
+          <w:tcPr>
+            <w:tcW w:w="1337" w:type="dxa"/>
+          </w:tcPr>
+          <w:p>
+            <w:pPr/>
+            <w:r>
+              <w:t xml:space="preserve">CVAE − Bootstrap</w:t>
+            </w:r>
+          </w:p>
+        </w:tc>
+        <w:tc>
+          <w:tcPr>
+            <w:tcW w:w="1337" w:type="dxa"/>
+          </w:tcPr>
+          <w:p>
+            <w:pPr/>
+            <w:r>
+              <w:t xml:space="preserve">Energy score</w:t>
+            </w:r>
+          </w:p>
+        </w:tc>
+        <w:tc>
+          <w:tcPr>
+            <w:tcW w:w="1337" w:type="dxa"/>
+          </w:tcPr>
+          <w:p>
+            <w:pPr/>
+            <w:r>
+              <w:t xml:space="preserve">−0.001</w:t>
+            </w:r>
+          </w:p>
+        </w:tc>
+        <w:tc>
+          <w:tcPr>
+            <w:tcW w:w="1337" w:type="dxa"/>
+          </w:tcPr>
+          <w:p>
+            <w:pPr/>
+            <w:r>
+              <w:t xml:space="preserve">[−0.015, 0.014]</w:t>
+            </w:r>
+          </w:p>
+        </w:tc>
+        <w:tc>
+          <w:tcPr>
+            <w:tcW w:w="1337" w:type="dxa"/>
+          </w:tcPr>
+          <w:p>
+            <w:pPr/>
+            <w:r>
+              <w:t xml:space="preserve">0.17</w:t>
+            </w:r>
+          </w:p>
+        </w:tc>
+        <w:tc>
+          <w:tcPr>
+            <w:tcW w:w="1337" w:type="dxa"/>
+          </w:tcPr>
+          <w:p>
+            <w:pPr/>
+            <w:r>
+              <w:t xml:space="preserve">43 / 73</w:t>
+            </w:r>
+          </w:p>
+        </w:tc>
+      </w:tr>
+      <w:tr>
+        <w:tc>
+          <w:tcPr>
+            <w:tcW w:w="1337" w:type="dxa"/>
+          </w:tcPr>
+          <w:p>
+            <w:pPr/>
+            <w:r>
+              <w:t xml:space="preserve">B</w:t>
+            </w:r>
+          </w:p>
+        </w:tc>
+        <w:tc>
+          <w:tcPr>
+            <w:tcW w:w="1337" w:type="dxa"/>
+          </w:tcPr>
+          <w:p>
+            <w:pPr/>
+            <w:r>
+              <w:t xml:space="preserve">CVAE − Bootstrap</w:t>
+            </w:r>
+          </w:p>
+        </w:tc>
+        <w:tc>
+          <w:tcPr>
+            <w:tcW w:w="1337" w:type="dxa"/>
+          </w:tcPr>
+          <w:p>
+            <w:pPr/>
+            <w:r>
+              <w:t xml:space="preserve">CRPS</w:t>
+            </w:r>
+          </w:p>
+        </w:tc>
+        <w:tc>
+          <w:tcPr>
+            <w:tcW w:w="1337" w:type="dxa"/>
+          </w:tcPr>
+          <w:p>
+            <w:pPr/>
+            <w:r>
+              <w:t xml:space="preserve">0.000</w:t>
+            </w:r>
+          </w:p>
+        </w:tc>
+        <w:tc>
+          <w:tcPr>
+            <w:tcW w:w="1337" w:type="dxa"/>
+          </w:tcPr>
+          <w:p>
+            <w:pPr/>
+            <w:r>
+              <w:t xml:space="preserve">[−0.050, 0.055]</w:t>
+            </w:r>
+          </w:p>
+        </w:tc>
+        <w:tc>
+          <w:tcPr>
+            <w:tcW w:w="1337" w:type="dxa"/>
+          </w:tcPr>
+          <w:p>
+            <w:pPr/>
+            <w:r>
+              <w:t xml:space="preserve">0.33</w:t>
+            </w:r>
+          </w:p>
+        </w:tc>
+        <w:tc>
+          <w:tcPr>
+            <w:tcW w:w="1337" w:type="dxa"/>
+          </w:tcPr>
+          <w:p>
+            <w:pPr/>
+            <w:r>
+              <w:t xml:space="preserve">42 / 73</w:t>
+            </w:r>
+          </w:p>
+        </w:tc>
+      </w:tr>
+    </w:tbl>
+    <w:p>
+      <w:pPr/>
+      <w:r>
+        <w:t xml:space="preserve">Every interval contains zero, so on point-wise skill the three generators are statistically indistinguishable with 73 test days. This is an honest and useful negative result: a deep generative model does not automatically beat simple resampling on forecast-style scores.</w:t>
+      </w:r>
+    </w:p>
+    <w:p>
+      <w:pPr/>
+      <w:r>
+        <w:rPr>
+          <w:b/>
+        </w:rPr>
+        <w:t xml:space="preserve">Calibration, distribution and structure.</w:t>
+      </w:r>
+      <w:r>
+        <w:t xml:space="preserve"> The PIT of observed daily insolation within each 100-member ensemble was binned into quintiles and tested against uniformity with a χ² test (4 degrees of freedom); pooled generated daily insolation was compared with the held-out days by a two-sample Kolmogorov–Smirnov (KS) test and the Wasserstein distance; and the mean absolute error between generated and observed inter-hour correlation matrices of the clearness index (daylight hours) measures how well the diurnal structure is reproduced.</w:t>
+      </w:r>
+    </w:p>
+    <w:tbl>
+      <w:tblPr>
+        <w:tblStyle w:val="TableGrid"/>
+        <w:tblW w:w="0" w:type="auto"/>
+        <w:tblLayout w:type="fixed"/>
+        <w:tblLook w:val="04A0" w:firstRow="1" w:lastRow="0" w:firstColumn="0" w:lastColumn="0" w:noHBand="0" w:noVBand="1"/>
+      </w:tblPr>
+      <w:tblGrid>
+        <w:gridCol w:w="1337"/>
+        <w:gridCol w:w="1337"/>
+        <w:gridCol w:w="1337"/>
+        <w:gridCol w:w="1337"/>
+        <w:gridCol w:w="1337"/>
+        <w:gridCol w:w="1337"/>
+        <w:gridCol w:w="1337"/>
+      </w:tblGrid>
+      <w:tr>
+        <w:trPr>
+          <w:tblHeader/>
+        </w:trPr>
+        <w:tc>
+          <w:tcPr>
+            <w:tcW w:w="1337" w:type="dxa"/>
+            <w:shd w:val="clear" w:color="auto" w:fill="F2F2F2"/>
+          </w:tcPr>
+          <w:p>
+            <w:pPr/>
+            <w:r>
+              <w:t xml:space="preserve">Site</w:t>
+            </w:r>
+          </w:p>
+        </w:tc>
+        <w:tc>
+          <w:tcPr>
+            <w:tcW w:w="1337" w:type="dxa"/>
+            <w:shd w:val="clear" w:color="auto" w:fill="F2F2F2"/>
+          </w:tcPr>
+          <w:p>
+            <w:pPr/>
+            <w:r>
+              <w:t xml:space="preserve">Method</w:t>
+            </w:r>
+          </w:p>
+        </w:tc>
+        <w:tc>
+          <w:tcPr>
+            <w:tcW w:w="1337" w:type="dxa"/>
+            <w:shd w:val="clear" w:color="auto" w:fill="F2F2F2"/>
+          </w:tcPr>
+          <w:p>
+            <w:pPr/>
+            <w:r>
+              <w:t xml:space="preserve">PIT χ² (p)</w:t>
+            </w:r>
+          </w:p>
+        </w:tc>
+        <w:tc>
+          <w:tcPr>
+            <w:tcW w:w="1337" w:type="dxa"/>
+            <w:shd w:val="clear" w:color="auto" w:fill="F2F2F2"/>
+          </w:tcPr>
+          <w:p>
+            <w:pPr/>
+            <w:r>
+              <w:t xml:space="preserve">KS D (p)</w:t>
+            </w:r>
+          </w:p>
+        </w:tc>
+        <w:tc>
+          <w:tcPr>
+            <w:tcW w:w="1337" w:type="dxa"/>
+            <w:shd w:val="clear" w:color="auto" w:fill="F2F2F2"/>
+          </w:tcPr>
+          <w:p>
+            <w:pPr/>
+            <w:r>
+              <w:t xml:space="preserve">Wasserstein (kWh/m²)</w:t>
+            </w:r>
+          </w:p>
+        </w:tc>
+        <w:tc>
+          <w:tcPr>
+            <w:tcW w:w="1337" w:type="dxa"/>
+            <w:shd w:val="clear" w:color="auto" w:fill="F2F2F2"/>
+          </w:tcPr>
+          <w:p>
+            <w:pPr/>
+            <w:r>
+              <w:t xml:space="preserve">Mean ± SD generated vs observed (kWh/m²·day)</w:t>
+            </w:r>
+          </w:p>
+        </w:tc>
+        <w:tc>
+          <w:tcPr>
+            <w:tcW w:w="1337" w:type="dxa"/>
+            <w:shd w:val="clear" w:color="auto" w:fill="F2F2F2"/>
+          </w:tcPr>
+          <w:p>
+            <w:pPr/>
+            <w:r>
+              <w:t xml:space="preserve">Hour-correlation error</w:t>
+            </w:r>
+          </w:p>
+        </w:tc>
+      </w:tr>
+      <w:tr>
+        <w:tc>
+          <w:tcPr>
+            <w:tcW w:w="1337" w:type="dxa"/>
+          </w:tcPr>
+          <w:p>
+            <w:pPr/>
+            <w:r>
+              <w:t xml:space="preserve">A</w:t>
+            </w:r>
+          </w:p>
+        </w:tc>
+        <w:tc>
+          <w:tcPr>
+            <w:tcW w:w="1337" w:type="dxa"/>
+          </w:tcPr>
+          <w:p>
+            <w:pPr/>
+            <w:r>
+              <w:rPr>
+                <w:b/>
+              </w:rPr>
+              <w:t xml:space="preserve">CVAE</w:t>
+            </w:r>
+          </w:p>
+        </w:tc>
+        <w:tc>
+          <w:tcPr>
+            <w:tcW w:w="1337" w:type="dxa"/>
+          </w:tcPr>
+          <w:p>
+            <w:pPr/>
+            <w:r>
+              <w:rPr>
+                <w:b/>
+              </w:rPr>
+              <w:t xml:space="preserve">2.96 (0.56)</w:t>
+            </w:r>
+          </w:p>
+        </w:tc>
+        <w:tc>
+          <w:tcPr>
+            <w:tcW w:w="1337" w:type="dxa"/>
+          </w:tcPr>
+          <w:p>
+            <w:pPr/>
+            <w:r>
+              <w:t xml:space="preserve">0.078 (0.75)</w:t>
+            </w:r>
+          </w:p>
+        </w:tc>
+        <w:tc>
+          <w:tcPr>
+            <w:tcW w:w="1337" w:type="dxa"/>
+          </w:tcPr>
+          <w:p>
+            <w:pPr/>
+            <w:r>
+              <w:t xml:space="preserve">0.244</w:t>
+            </w:r>
+          </w:p>
+        </w:tc>
+        <w:tc>
+          <w:tcPr>
+            <w:tcW w:w="1337" w:type="dxa"/>
+          </w:tcPr>
+          <w:p>
+            <w:pPr/>
+            <w:r>
+              <w:t xml:space="preserve">4.83 ± 2.32 vs 4.79 ± 2.41</w:t>
+            </w:r>
+          </w:p>
+        </w:tc>
+        <w:tc>
+          <w:tcPr>
+            <w:tcW w:w="1337" w:type="dxa"/>
+          </w:tcPr>
+          <w:p>
+            <w:pPr/>
+            <w:r>
+              <w:rPr>
+                <w:b/>
+              </w:rPr>
+              <w:t xml:space="preserve">0.066</w:t>
+            </w:r>
+          </w:p>
+        </w:tc>
+      </w:tr>
+      <w:tr>
+        <w:tc>
+          <w:tcPr>
+            <w:tcW w:w="1337" w:type="dxa"/>
+          </w:tcPr>
+          <w:p>
+            <w:pPr/>
+            <w:r>
+              <w:t xml:space="preserve">A</w:t>
+            </w:r>
+          </w:p>
+        </w:tc>
+        <w:tc>
+          <w:tcPr>
+            <w:tcW w:w="1337" w:type="dxa"/>
+          </w:tcPr>
+          <w:p>
+            <w:pPr/>
+            <w:r>
+              <w:t xml:space="preserve">Gaussian</w:t>
+            </w:r>
+          </w:p>
+        </w:tc>
+        <w:tc>
+          <w:tcPr>
+            <w:tcW w:w="1337" w:type="dxa"/>
+          </w:tcPr>
+          <w:p>
+            <w:pPr/>
+            <w:r>
+              <w:t xml:space="preserve">27.5 (&lt; 0.001)</w:t>
+            </w:r>
+          </w:p>
+        </w:tc>
+        <w:tc>
+          <w:tcPr>
+            <w:tcW w:w="1337" w:type="dxa"/>
+          </w:tcPr>
+          <w:p>
+            <w:pPr/>
+            <w:r>
+              <w:t xml:space="preserve">0.090 (0.58)</w:t>
+            </w:r>
+          </w:p>
+        </w:tc>
+        <w:tc>
+          <w:tcPr>
+            <w:tcW w:w="1337" w:type="dxa"/>
+          </w:tcPr>
+          <w:p>
+            <w:pPr/>
+            <w:r>
+              <w:t xml:space="preserve">0.301</w:t>
+            </w:r>
+          </w:p>
+        </w:tc>
+        <w:tc>
+          <w:tcPr>
+            <w:tcW w:w="1337" w:type="dxa"/>
+          </w:tcPr>
+          <w:p>
+            <w:pPr/>
+            <w:r>
+              <w:t xml:space="preserve">4.77 ± 2.30</w:t>
+            </w:r>
+          </w:p>
+        </w:tc>
+        <w:tc>
+          <w:tcPr>
+            <w:tcW w:w="1337" w:type="dxa"/>
+          </w:tcPr>
+          <w:p>
+            <w:pPr/>
+            <w:r>
+              <w:t xml:space="preserve">0.109</w:t>
+            </w:r>
+          </w:p>
+        </w:tc>
+      </w:tr>
+      <w:tr>
+        <w:tc>
+          <w:tcPr>
+            <w:tcW w:w="1337" w:type="dxa"/>
+          </w:tcPr>
+          <w:p>
+            <w:pPr/>
+            <w:r>
+              <w:t xml:space="preserve">A</w:t>
+            </w:r>
+          </w:p>
+        </w:tc>
+        <w:tc>
+          <w:tcPr>
+            <w:tcW w:w="1337" w:type="dxa"/>
+          </w:tcPr>
+          <w:p>
+            <w:pPr/>
+            <w:r>
+              <w:t xml:space="preserve">Bootstrap</w:t>
+            </w:r>
+          </w:p>
+        </w:tc>
+        <w:tc>
+          <w:tcPr>
+            <w:tcW w:w="1337" w:type="dxa"/>
+          </w:tcPr>
+          <w:p>
+            <w:pPr/>
+            <w:r>
+              <w:t xml:space="preserve">10.4 (0.035)</w:t>
+            </w:r>
+          </w:p>
+        </w:tc>
+        <w:tc>
+          <w:tcPr>
+            <w:tcW w:w="1337" w:type="dxa"/>
+          </w:tcPr>
+          <w:p>
+            <w:pPr/>
+            <w:r>
+              <w:t xml:space="preserve">0.075 (0.79)</w:t>
+            </w:r>
+          </w:p>
+        </w:tc>
+        <w:tc>
+          <w:tcPr>
+            <w:tcW w:w="1337" w:type="dxa"/>
+          </w:tcPr>
+          <w:p>
+            <w:pPr/>
+            <w:r>
+              <w:t xml:space="preserve">0.263</w:t>
+            </w:r>
+          </w:p>
+        </w:tc>
+        <w:tc>
+          <w:tcPr>
+            <w:tcW w:w="1337" w:type="dxa"/>
+          </w:tcPr>
+          <w:p>
+            <w:pPr/>
+            <w:r>
+              <w:t xml:space="preserve">4.76 ± 2.31</w:t>
+            </w:r>
+          </w:p>
+        </w:tc>
+        <w:tc>
+          <w:tcPr>
+            <w:tcW w:w="1337" w:type="dxa"/>
+          </w:tcPr>
+          <w:p>
+            <w:pPr/>
+            <w:r>
+              <w:t xml:space="preserve">0.074</w:t>
+            </w:r>
+          </w:p>
+        </w:tc>
+      </w:tr>
+      <w:tr>
+        <w:tc>
+          <w:tcPr>
+            <w:tcW w:w="1337" w:type="dxa"/>
+          </w:tcPr>
+          <w:p>
+            <w:pPr/>
+            <w:r>
+              <w:t xml:space="preserve">B</w:t>
+            </w:r>
+          </w:p>
+        </w:tc>
+        <w:tc>
+          <w:tcPr>
+            <w:tcW w:w="1337" w:type="dxa"/>
+          </w:tcPr>
+          <w:p>
+            <w:pPr/>
+            <w:r>
+              <w:rPr>
+                <w:b/>
+              </w:rPr>
+              <w:t xml:space="preserve">CVAE</w:t>
+            </w:r>
+          </w:p>
+        </w:tc>
+        <w:tc>
+          <w:tcPr>
+            <w:tcW w:w="1337" w:type="dxa"/>
+          </w:tcPr>
+          <w:p>
+            <w:pPr/>
+            <w:r>
+              <w:rPr>
+                <w:b/>
+              </w:rPr>
+              <w:t xml:space="preserve">0.90 (0.92)</w:t>
+            </w:r>
+          </w:p>
+        </w:tc>
+        <w:tc>
+          <w:tcPr>
+            <w:tcW w:w="1337" w:type="dxa"/>
+          </w:tcPr>
+          <w:p>
+            <w:pPr/>
+            <w:r>
+              <w:t xml:space="preserve">0.079 (0.73)</w:t>
+            </w:r>
+          </w:p>
+        </w:tc>
+        <w:tc>
+          <w:tcPr>
+            <w:tcW w:w="1337" w:type="dxa"/>
+          </w:tcPr>
+          <w:p>
+            <w:pPr/>
+            <w:r>
+              <w:t xml:space="preserve">0.163</w:t>
+            </w:r>
+          </w:p>
+        </w:tc>
+        <w:tc>
+          <w:tcPr>
+            <w:tcW w:w="1337" w:type="dxa"/>
+          </w:tcPr>
+          <w:p>
+            <w:pPr/>
+            <w:r>
+              <w:t xml:space="preserve">4.37 ± 1.93 vs 4.23 ± 1.85</w:t>
+            </w:r>
+          </w:p>
+        </w:tc>
+        <w:tc>
+          <w:tcPr>
+            <w:tcW w:w="1337" w:type="dxa"/>
+          </w:tcPr>
+          <w:p>
+            <w:pPr/>
+            <w:r>
+              <w:t xml:space="preserve">0.107</w:t>
+            </w:r>
+          </w:p>
+        </w:tc>
+      </w:tr>
+      <w:tr>
+        <w:tc>
+          <w:tcPr>
+            <w:tcW w:w="1337" w:type="dxa"/>
+          </w:tcPr>
+          <w:p>
+            <w:pPr/>
+            <w:r>
+              <w:t xml:space="preserve">B</w:t>
+            </w:r>
+          </w:p>
+        </w:tc>
+        <w:tc>
+          <w:tcPr>
+            <w:tcW w:w="1337" w:type="dxa"/>
+          </w:tcPr>
+          <w:p>
+            <w:pPr/>
+            <w:r>
+              <w:t xml:space="preserve">Gaussian</w:t>
+            </w:r>
+          </w:p>
+        </w:tc>
+        <w:tc>
+          <w:tcPr>
+            <w:tcW w:w="1337" w:type="dxa"/>
+          </w:tcPr>
+          <w:p>
+            <w:pPr/>
+            <w:r>
+              <w:t xml:space="preserve">10.6 (0.031)</w:t>
+            </w:r>
+          </w:p>
+        </w:tc>
+        <w:tc>
+          <w:tcPr>
+            <w:tcW w:w="1337" w:type="dxa"/>
+          </w:tcPr>
+          <w:p>
+            <w:pPr/>
+            <w:r>
+              <w:t xml:space="preserve">0.069 (0.86)</w:t>
+            </w:r>
+          </w:p>
+        </w:tc>
+        <w:tc>
+          <w:tcPr>
+            <w:tcW w:w="1337" w:type="dxa"/>
+          </w:tcPr>
+          <w:p>
+            <w:pPr/>
+            <w:r>
+              <w:t xml:space="preserve">0.174</w:t>
+            </w:r>
+          </w:p>
+        </w:tc>
+        <w:tc>
+          <w:tcPr>
+            <w:tcW w:w="1337" w:type="dxa"/>
+          </w:tcPr>
+          <w:p>
+            <w:pPr/>
+            <w:r>
+              <w:t xml:space="preserve">4.26 ± 1.84</w:t>
+            </w:r>
+          </w:p>
+        </w:tc>
+        <w:tc>
+          <w:tcPr>
+            <w:tcW w:w="1337" w:type="dxa"/>
+          </w:tcPr>
+          <w:p>
+            <w:pPr/>
+            <w:r>
+              <w:t xml:space="preserve">0.102</w:t>
+            </w:r>
+          </w:p>
+        </w:tc>
+      </w:tr>
+      <w:tr>
+        <w:tc>
+          <w:tcPr>
+            <w:tcW w:w="1337" w:type="dxa"/>
+          </w:tcPr>
+          <w:p>
+            <w:pPr/>
+            <w:r>
+              <w:t xml:space="preserve">B</w:t>
+            </w:r>
+          </w:p>
+        </w:tc>
+        <w:tc>
+          <w:tcPr>
+            <w:tcW w:w="1337" w:type="dxa"/>
+          </w:tcPr>
+          <w:p>
+            <w:pPr/>
+            <w:r>
+              <w:t xml:space="preserve">Bootstrap</w:t>
+            </w:r>
+          </w:p>
+        </w:tc>
+        <w:tc>
+          <w:tcPr>
+            <w:tcW w:w="1337" w:type="dxa"/>
+          </w:tcPr>
+          <w:p>
+            <w:pPr/>
+            <w:r>
+              <w:t xml:space="preserve">5.97 (0.20)</w:t>
+            </w:r>
+          </w:p>
+        </w:tc>
+        <w:tc>
+          <w:tcPr>
+            <w:tcW w:w="1337" w:type="dxa"/>
+          </w:tcPr>
+          <w:p>
+            <w:pPr/>
+            <w:r>
+              <w:t xml:space="preserve">0.070 (0.85)</w:t>
+            </w:r>
+          </w:p>
+        </w:tc>
+        <w:tc>
+          <w:tcPr>
+            <w:tcW w:w="1337" w:type="dxa"/>
+          </w:tcPr>
+          <w:p>
+            <w:pPr/>
+            <w:r>
+              <w:t xml:space="preserve">0.126</w:t>
+            </w:r>
+          </w:p>
+        </w:tc>
+        <w:tc>
+          <w:tcPr>
+            <w:tcW w:w="1337" w:type="dxa"/>
+          </w:tcPr>
+          <w:p>
+            <w:pPr/>
+            <w:r>
+              <w:t xml:space="preserve">4.31 ± 1.94</w:t>
+            </w:r>
+          </w:p>
+        </w:tc>
+        <w:tc>
+          <w:tcPr>
+            <w:tcW w:w="1337" w:type="dxa"/>
+          </w:tcPr>
+          <w:p>
+            <w:pPr/>
+            <w:r>
+              <w:t xml:space="preserve">0.083</w:t>
+            </w:r>
+          </w:p>
+        </w:tc>
+      </w:tr>
+    </w:tbl>
+    <w:p>
+      <w:pPr/>
+      <w:r>
+        <w:t xml:space="preserve">Three findings follow. (i) The Gaussian model is mis-calibrated at both sites (PIT p &lt; 0.05) and the bootstrap at site A (p = 0.035); the CVAE passes comfortably at both (p = 0.56, 0.92), so its 90 % intervals can be trusted as stated. (ii) No KS test rejects (all p &gt; 0.5): all three reproduce the marginal distribution of daily energy. (iii) The CVAE best reproduces the hour-to-hour correlation at the arid site (error 0.066), where cloud structure is simple, but not at the humid site (0.107 vs 0.083 for the bootstrap), where convective clouds create more complex intraday patterns. At site B the CVAE also over-estimates mean daily insolation by 3.4 % (4.37 vs 4.23 kWh/m²), a bias that makes its designs slightly optimistic.</w:t>
+      </w:r>
+    </w:p>
+    <w:p>
+      <w:pPr>
+        <w:pStyle w:val="Heading3"/>
+      </w:pPr>
+      <w:r>
+        <w:t xml:space="preserve">7.3 Persistence and extreme-spell statistics of synthetic years</w:t>
+      </w:r>
+    </w:p>
+    <w:p>
+      <w:pPr/>
+      <w:r>
+        <w:t xml:space="preserve">The latent AR(1) process gives CVAE years the observed day-to-day persistence; bootstrap years have none. That is the CVAE's decisive advantage for storage studies — and the bootstrap's hidden weakness as a referee.</w:t>
+      </w:r>
+    </w:p>
+    <w:p>
+      <w:pPr/>
+      <w:r>
+        <w:t xml:space="preserve">For each of 200 synthetic years per method, the lag-1 autocorrelation of deseasonalised daily insolation, the annual total, and the worst 3-day mean insolation (the deepest short dark spell) were computed.</w:t>
+      </w:r>
+    </w:p>
+    <w:tbl>
+      <w:tblPr>
+        <w:tblStyle w:val="TableGrid"/>
+        <w:tblW w:w="0" w:type="auto"/>
+        <w:tblLayout w:type="fixed"/>
+        <w:tblLook w:val="04A0" w:firstRow="1" w:lastRow="0" w:firstColumn="0" w:lastColumn="0" w:noHBand="0" w:noVBand="1"/>
+      </w:tblPr>
+      <w:tblGrid>
+        <w:gridCol w:w="1337"/>
+        <w:gridCol w:w="1337"/>
+        <w:gridCol w:w="1337"/>
+        <w:gridCol w:w="1337"/>
+        <w:gridCol w:w="1337"/>
+        <w:gridCol w:w="1337"/>
+        <w:gridCol w:w="1337"/>
+      </w:tblGrid>
+      <w:tr>
+        <w:trPr>
+          <w:tblHeader/>
+        </w:trPr>
+        <w:tc>
+          <w:tcPr>
+            <w:tcW w:w="1337" w:type="dxa"/>
+            <w:shd w:val="clear" w:color="auto" w:fill="F2F2F2"/>
+          </w:tcPr>
+          <w:p>
+            <w:pPr/>
+            <w:r>
+              <w:t xml:space="preserve">Statistic</w:t>
+            </w:r>
+          </w:p>
+        </w:tc>
+        <w:tc>
+          <w:tcPr>
+            <w:tcW w:w="1337" w:type="dxa"/>
+            <w:shd w:val="clear" w:color="auto" w:fill="F2F2F2"/>
+          </w:tcPr>
+          <w:p>
+            <w:pPr/>
+            <w:r>
+              <w:t xml:space="preserve">Site A observed</w:t>
+            </w:r>
+          </w:p>
+        </w:tc>
+        <w:tc>
+          <w:tcPr>
+            <w:tcW w:w="1337" w:type="dxa"/>
+            <w:shd w:val="clear" w:color="auto" w:fill="F2F2F2"/>
+          </w:tcPr>
+          <w:p>
+            <w:pPr/>
+            <w:r>
+              <w:t xml:space="preserve">Site A CVAE years</w:t>
+            </w:r>
+          </w:p>
+        </w:tc>
+        <w:tc>
+          <w:tcPr>
+            <w:tcW w:w="1337" w:type="dxa"/>
+            <w:shd w:val="clear" w:color="auto" w:fill="F2F2F2"/>
+          </w:tcPr>
+          <w:p>
+            <w:pPr/>
+            <w:r>
+              <w:t xml:space="preserve">Site A bootstrap years</w:t>
+            </w:r>
+          </w:p>
+        </w:tc>
+        <w:tc>
+          <w:tcPr>
+            <w:tcW w:w="1337" w:type="dxa"/>
+            <w:shd w:val="clear" w:color="auto" w:fill="F2F2F2"/>
+          </w:tcPr>
+          <w:p>
+            <w:pPr/>
+            <w:r>
+              <w:t xml:space="preserve">Site B observed</w:t>
+            </w:r>
+          </w:p>
+        </w:tc>
+        <w:tc>
+          <w:tcPr>
+            <w:tcW w:w="1337" w:type="dxa"/>
+            <w:shd w:val="clear" w:color="auto" w:fill="F2F2F2"/>
+          </w:tcPr>
+          <w:p>
+            <w:pPr/>
+            <w:r>
+              <w:t xml:space="preserve">Site B CVAE years</w:t>
+            </w:r>
+          </w:p>
+        </w:tc>
+        <w:tc>
+          <w:tcPr>
+            <w:tcW w:w="1337" w:type="dxa"/>
+            <w:shd w:val="clear" w:color="auto" w:fill="F2F2F2"/>
+          </w:tcPr>
+          <w:p>
+            <w:pPr/>
+            <w:r>
+              <w:t xml:space="preserve">Site B bootstrap years</w:t>
+            </w:r>
+          </w:p>
+        </w:tc>
+      </w:tr>
+      <w:tr>
+        <w:tc>
+          <w:tcPr>
+            <w:tcW w:w="1337" w:type="dxa"/>
+          </w:tcPr>
+          <w:p>
+            <w:pPr/>
+            <w:r>
+              <w:t xml:space="preserve">Lag-1 autocorrelation, mean [5 %, 95 %]</w:t>
+            </w:r>
+          </w:p>
+        </w:tc>
+        <w:tc>
+          <w:tcPr>
+            <w:tcW w:w="1337" w:type="dxa"/>
+          </w:tcPr>
+          <w:p>
+            <w:pPr/>
+            <w:r>
+              <w:t xml:space="preserve">0.28</w:t>
+            </w:r>
+          </w:p>
+        </w:tc>
+        <w:tc>
+          <w:tcPr>
+            <w:tcW w:w="1337" w:type="dxa"/>
+          </w:tcPr>
+          <w:p>
+            <w:pPr/>
+            <w:r>
+              <w:rPr>
+                <w:b/>
+              </w:rPr>
+              <w:t xml:space="preserve">0.29</w:t>
+            </w:r>
+            <w:r>
+              <w:t xml:space="preserve"> [0.19, 0.37]</w:t>
+            </w:r>
+          </w:p>
+        </w:tc>
+        <w:tc>
+          <w:tcPr>
+            <w:tcW w:w="1337" w:type="dxa"/>
+          </w:tcPr>
+          <w:p>
+            <w:pPr/>
+            <w:r>
+              <w:t xml:space="preserve">−0.03 [−0.14, 0.07]</w:t>
+            </w:r>
+          </w:p>
+        </w:tc>
+        <w:tc>
+          <w:tcPr>
+            <w:tcW w:w="1337" w:type="dxa"/>
+          </w:tcPr>
+          <w:p>
+            <w:pPr/>
+            <w:r>
+              <w:t xml:space="preserve">0.25</w:t>
+            </w:r>
+          </w:p>
+        </w:tc>
+        <w:tc>
+          <w:tcPr>
+            <w:tcW w:w="1337" w:type="dxa"/>
+          </w:tcPr>
+          <w:p>
+            <w:pPr/>
+            <w:r>
+              <w:rPr>
+                <w:b/>
+              </w:rPr>
+              <w:t xml:space="preserve">0.25</w:t>
+            </w:r>
+            <w:r>
+              <w:t xml:space="preserve"> [0.15, 0.34]</w:t>
+            </w:r>
+          </w:p>
+        </w:tc>
+        <w:tc>
+          <w:tcPr>
+            <w:tcW w:w="1337" w:type="dxa"/>
+          </w:tcPr>
+          <w:p>
+            <w:pPr/>
+            <w:r>
+              <w:t xml:space="preserve">−0.02 [−0.12, 0.08]</w:t>
+            </w:r>
+          </w:p>
+        </w:tc>
+      </w:tr>
+      <w:tr>
+        <w:tc>
+          <w:tcPr>
+            <w:tcW w:w="1337" w:type="dxa"/>
+          </w:tcPr>
+          <w:p>
+            <w:pPr/>
+            <w:r>
+              <w:t xml:space="preserve">Annual insolation, mean ± SD (kWh/m²)</w:t>
+            </w:r>
+          </w:p>
+        </w:tc>
+        <w:tc>
+          <w:tcPr>
+            <w:tcW w:w="1337" w:type="dxa"/>
+          </w:tcPr>
+          <w:p>
+            <w:pPr/>
+            <w:r>
+              <w:t xml:space="preserve">1 749</w:t>
+            </w:r>
+          </w:p>
+        </w:tc>
+        <w:tc>
+          <w:tcPr>
+            <w:tcW w:w="1337" w:type="dxa"/>
+          </w:tcPr>
+          <w:p>
+            <w:pPr/>
+            <w:r>
+              <w:t xml:space="preserve">1 761 ± 33</w:t>
+            </w:r>
+          </w:p>
+        </w:tc>
+        <w:tc>
+          <w:tcPr>
+            <w:tcW w:w="1337" w:type="dxa"/>
+          </w:tcPr>
+          <w:p>
+            <w:pPr/>
+            <w:r>
+              <w:t xml:space="preserve">1 735 ± 21</w:t>
+            </w:r>
+          </w:p>
+        </w:tc>
+        <w:tc>
+          <w:tcPr>
+            <w:tcW w:w="1337" w:type="dxa"/>
+          </w:tcPr>
+          <w:p>
+            <w:pPr/>
+            <w:r>
+              <w:t xml:space="preserve">1 566</w:t>
+            </w:r>
+          </w:p>
+        </w:tc>
+        <w:tc>
+          <w:tcPr>
+            <w:tcW w:w="1337" w:type="dxa"/>
+          </w:tcPr>
+          <w:p>
+            <w:pPr/>
+            <w:r>
+              <w:t xml:space="preserve">1 589 ± 27</w:t>
+            </w:r>
+          </w:p>
+        </w:tc>
+        <w:tc>
+          <w:tcPr>
+            <w:tcW w:w="1337" w:type="dxa"/>
+          </w:tcPr>
+          <w:p>
+            <w:pPr/>
+            <w:r>
+              <w:t xml:space="preserve">1 554 ± 24</w:t>
+            </w:r>
+          </w:p>
+        </w:tc>
+      </w:tr>
+      <w:tr>
+        <w:tc>
+          <w:tcPr>
+            <w:tcW w:w="1337" w:type="dxa"/>
+          </w:tcPr>
+          <w:p>
+            <w:pPr/>
+            <w:r>
+              <w:t xml:space="preserve">Worst 3-day mean, mean (5 % quantile), kWh/m²·day</w:t>
+            </w:r>
+          </w:p>
+        </w:tc>
+        <w:tc>
+          <w:tcPr>
+            <w:tcW w:w="1337" w:type="dxa"/>
+          </w:tcPr>
+          <w:p>
+            <w:pPr/>
+            <w:r>
+              <w:t xml:space="preserve">0.92</w:t>
+            </w:r>
+          </w:p>
+        </w:tc>
+        <w:tc>
+          <w:tcPr>
+            <w:tcW w:w="1337" w:type="dxa"/>
+          </w:tcPr>
+          <w:p>
+            <w:pPr/>
+            <w:r>
+              <w:t xml:space="preserve">1.05 (0.68)</w:t>
+            </w:r>
+          </w:p>
+        </w:tc>
+        <w:tc>
+          <w:tcPr>
+            <w:tcW w:w="1337" w:type="dxa"/>
+          </w:tcPr>
+          <w:p>
+            <w:pPr/>
+            <w:r>
+              <w:t xml:space="preserve">0.98 (0.77)</w:t>
+            </w:r>
+          </w:p>
+        </w:tc>
+        <w:tc>
+          <w:tcPr>
+            <w:tcW w:w="1337" w:type="dxa"/>
+          </w:tcPr>
+          <w:p>
+            <w:pPr/>
+            <w:r>
+              <w:t xml:space="preserve">0.89</w:t>
+            </w:r>
+          </w:p>
+        </w:tc>
+        <w:tc>
+          <w:tcPr>
+            <w:tcW w:w="1337" w:type="dxa"/>
+          </w:tcPr>
+          <w:p>
+            <w:pPr/>
+            <w:r>
+              <w:t xml:space="preserve">1.00 (0.66)</w:t>
+            </w:r>
+          </w:p>
+        </w:tc>
+        <w:tc>
+          <w:tcPr>
+            <w:tcW w:w="1337" w:type="dxa"/>
+          </w:tcPr>
+          <w:p>
+            <w:pPr/>
+            <w:r>
+              <w:t xml:space="preserve">1.12 (0.87)</w:t>
+            </w:r>
+          </w:p>
+        </w:tc>
+      </w:tr>
+    </w:tbl>
+    <w:p>
+      <w:pPr/>
+      <w:r>
+        <w:t xml:space="preserve">The distributions of lag-1 autocorrelation from the two methods differ decisively (two-sample KS p &lt; 10⁻¹⁰ at both sites), and only the CVAE's interval contains the observed value. Resampling days independently destroys persistence by construction, so bootstrap years under-state multi-day dark spells; the CVAE's 5 % worst-spell quantile (0.68 and 0.66 kWh/m²·day) is accordingly deeper than the bootstrap's (0.77 and 0.87).</w:t>
+      </w:r>
+    </w:p>
+    <w:p>
+      <w:pPr/>
+      <w:r>
+        <w:t xml:space="preserve">Two cautions refine Section 6.2. First, at site A the CVAE's </w:t>
+      </w:r>
+      <w:r>
+        <w:rPr>
+          <w:i/>
+        </w:rPr>
+        <w:t xml:space="preserve">typical</w:t>
+      </w:r>
+      <w:r>
+        <w:t xml:space="preserve"> worst spell (mean 1.05) is milder than the observed year's (0.92): its daily lower tail is slightly too light, even though its persistence is right. This, together with the bootstrap's sampling of real low days, explains why designs pass more often on CVAE years than on bootstrap years at site A. Second, because bootstrap years lack persistence, the bootstrap referee is itself optimistic about consecutive bad days; the true compliance of every design is therefore likely somewhat below the bootstrap figures. A combined generator — CVAE persistence with an empirically calibrated lower tail — is the natural next step.</w:t>
+      </w:r>
+    </w:p>
+    <w:p>
+      <w:pPr>
+        <w:pStyle w:val="Heading3"/>
+      </w:pPr>
+      <w:r>
+        <w:t xml:space="preserve">7.4 Monte Carlo confidence intervals and paired tests for the designs</w:t>
+      </w:r>
+    </w:p>
+    <w:p>
+      <w:pPr/>
+      <w:r>
+        <w:t xml:space="preserve">The reliability gain of the stochastic designs is overwhelmingly significant: in paired comparisons over the same 200 real-weather years, no year favours the deterministic design. The LCOH premium is also significant, but small.</w:t>
+      </w:r>
+    </w:p>
+    <w:p>
+      <w:pPr/>
+      <w:r>
+        <w:t xml:space="preserve">Each design was simulated on the same 200 bootstrap years, so comparisons are paired. The table gives the mean LCOH with a 95 % t-interval, the year-to-year standard deviation and 5–95 % range, and the share of compliant years (reliability ≥ 95 %) with a 95 % Wilson score interval.</w:t>
+      </w:r>
+    </w:p>
+    <w:tbl>
+      <w:tblPr>
+        <w:tblStyle w:val="TableGrid"/>
+        <w:tblW w:w="0" w:type="auto"/>
+        <w:tblLayout w:type="fixed"/>
+        <w:tblLook w:val="04A0" w:firstRow="1" w:lastRow="0" w:firstColumn="0" w:lastColumn="0" w:noHBand="0" w:noVBand="1"/>
+      </w:tblPr>
+      <w:tblGrid>
+        <w:gridCol w:w="1170"/>
+        <w:gridCol w:w="1170"/>
+        <w:gridCol w:w="1170"/>
+        <w:gridCol w:w="1170"/>
+        <w:gridCol w:w="1170"/>
+        <w:gridCol w:w="1170"/>
+        <w:gridCol w:w="1170"/>
+        <w:gridCol w:w="1170"/>
+      </w:tblGrid>
+      <w:tr>
+        <w:trPr>
+          <w:tblHeader/>
+        </w:trPr>
+        <w:tc>
+          <w:tcPr>
+            <w:tcW w:w="1170" w:type="dxa"/>
+            <w:shd w:val="clear" w:color="auto" w:fill="F2F2F2"/>
+          </w:tcPr>
+          <w:p>
+            <w:pPr/>
+            <w:r>
+              <w:t xml:space="preserve">Site</w:t>
+            </w:r>
+          </w:p>
+        </w:tc>
+        <w:tc>
+          <w:tcPr>
+            <w:tcW w:w="1170" w:type="dxa"/>
+            <w:shd w:val="clear" w:color="auto" w:fill="F2F2F2"/>
+          </w:tcPr>
+          <w:p>
+            <w:pPr/>
+            <w:r>
+              <w:t xml:space="preserve">Design</w:t>
+            </w:r>
+          </w:p>
+        </w:tc>
+        <w:tc>
+          <w:tcPr>
+            <w:tcW w:w="1170" w:type="dxa"/>
+            <w:shd w:val="clear" w:color="auto" w:fill="F2F2F2"/>
+          </w:tcPr>
+          <w:p>
+            <w:pPr/>
+            <w:r>
+              <w:t xml:space="preserve">Mean LCOH [95 % CI] (USD/kg)</w:t>
+            </w:r>
+          </w:p>
+        </w:tc>
+        <w:tc>
+          <w:tcPr>
+            <w:tcW w:w="1170" w:type="dxa"/>
+            <w:shd w:val="clear" w:color="auto" w:fill="F2F2F2"/>
+          </w:tcPr>
+          <w:p>
+            <w:pPr/>
+            <w:r>
+              <w:t xml:space="preserve">SD across years</w:t>
+            </w:r>
+          </w:p>
+        </w:tc>
+        <w:tc>
+          <w:tcPr>
+            <w:tcW w:w="1170" w:type="dxa"/>
+            <w:shd w:val="clear" w:color="auto" w:fill="F2F2F2"/>
+          </w:tcPr>
+          <w:p>
+            <w:pPr/>
+            <w:r>
+              <w:t xml:space="preserve">LCOH 5–95 %</w:t>
+            </w:r>
+          </w:p>
+        </w:tc>
+        <w:tc>
+          <w:tcPr>
+            <w:tcW w:w="1170" w:type="dxa"/>
+            <w:shd w:val="clear" w:color="auto" w:fill="F2F2F2"/>
+          </w:tcPr>
+          <w:p>
+            <w:pPr/>
+            <w:r>
+              <w:t xml:space="preserve">Mean reliability ± SD</w:t>
+            </w:r>
+          </w:p>
+        </w:tc>
+        <w:tc>
+          <w:tcPr>
+            <w:tcW w:w="1170" w:type="dxa"/>
+            <w:shd w:val="clear" w:color="auto" w:fill="F2F2F2"/>
+          </w:tcPr>
+          <w:p>
+            <w:pPr/>
+            <w:r>
+              <w:t xml:space="preserve">Worst-year reliability</w:t>
+            </w:r>
+          </w:p>
+        </w:tc>
+        <w:tc>
+          <w:tcPr>
+            <w:tcW w:w="1170" w:type="dxa"/>
+            <w:shd w:val="clear" w:color="auto" w:fill="F2F2F2"/>
+          </w:tcPr>
+          <w:p>
+            <w:pPr/>
+            <w:r>
+              <w:t xml:space="preserve">Compliant years [95 % Wilson CI]</w:t>
+            </w:r>
+          </w:p>
+        </w:tc>
+      </w:tr>
+      <w:tr>
+        <w:tc>
+          <w:tcPr>
+            <w:tcW w:w="1170" w:type="dxa"/>
+          </w:tcPr>
+          <w:p>
+            <w:pPr/>
+            <w:r>
+              <w:t xml:space="preserve">A</w:t>
+            </w:r>
+          </w:p>
+        </w:tc>
+        <w:tc>
+          <w:tcPr>
+            <w:tcW w:w="1170" w:type="dxa"/>
+          </w:tcPr>
+          <w:p>
+            <w:pPr/>
+            <w:r>
+              <w:t xml:space="preserve">Deterministic</w:t>
+            </w:r>
+          </w:p>
+        </w:tc>
+        <w:tc>
+          <w:tcPr>
+            <w:tcW w:w="1170" w:type="dxa"/>
+          </w:tcPr>
+          <w:p>
+            <w:pPr/>
+            <w:r>
+              <w:t xml:space="preserve">7.687 [7.676, 7.699]</w:t>
+            </w:r>
+          </w:p>
+        </w:tc>
+        <w:tc>
+          <w:tcPr>
+            <w:tcW w:w="1170" w:type="dxa"/>
+          </w:tcPr>
+          <w:p>
+            <w:pPr/>
+            <w:r>
+              <w:t xml:space="preserve">0.079</w:t>
+            </w:r>
+          </w:p>
+        </w:tc>
+        <w:tc>
+          <w:tcPr>
+            <w:tcW w:w="1170" w:type="dxa"/>
+          </w:tcPr>
+          <w:p>
+            <w:pPr/>
+            <w:r>
+              <w:t xml:space="preserve">7.56–7.81</w:t>
+            </w:r>
+          </w:p>
+        </w:tc>
+        <w:tc>
+          <w:tcPr>
+            <w:tcW w:w="1170" w:type="dxa"/>
+          </w:tcPr>
+          <w:p>
+            <w:pPr/>
+            <w:r>
+              <w:t xml:space="preserve">94.6 ± 0.8 %</w:t>
+            </w:r>
+          </w:p>
+        </w:tc>
+        <w:tc>
+          <w:tcPr>
+            <w:tcW w:w="1170" w:type="dxa"/>
+          </w:tcPr>
+          <w:p>
+            <w:pPr/>
+            <w:r>
+              <w:t xml:space="preserve">92.4 %</w:t>
+            </w:r>
+          </w:p>
+        </w:tc>
+        <w:tc>
+          <w:tcPr>
+            <w:tcW w:w="1170" w:type="dxa"/>
+          </w:tcPr>
+          <w:p>
+            <w:pPr/>
+            <w:r>
+              <w:t xml:space="preserve">32 % [26, 39]</w:t>
+            </w:r>
+          </w:p>
+        </w:tc>
+      </w:tr>
+      <w:tr>
+        <w:tc>
+          <w:tcPr>
+            <w:tcW w:w="1170" w:type="dxa"/>
+          </w:tcPr>
+          <w:p>
+            <w:pPr/>
+            <w:r>
+              <w:t xml:space="preserve">A</w:t>
+            </w:r>
+          </w:p>
+        </w:tc>
+        <w:tc>
+          <w:tcPr>
+            <w:tcW w:w="1170" w:type="dxa"/>
+          </w:tcPr>
+          <w:p>
+            <w:pPr/>
+            <w:r>
+              <w:t xml:space="preserve">Risk-neutral</w:t>
+            </w:r>
+          </w:p>
+        </w:tc>
+        <w:tc>
+          <w:tcPr>
+            <w:tcW w:w="1170" w:type="dxa"/>
+          </w:tcPr>
+          <w:p>
+            <w:pPr/>
+            <w:r>
+              <w:t xml:space="preserve">7.767 [7.756, 7.778]</w:t>
+            </w:r>
+          </w:p>
+        </w:tc>
+        <w:tc>
+          <w:tcPr>
+            <w:tcW w:w="1170" w:type="dxa"/>
+          </w:tcPr>
+          <w:p>
+            <w:pPr/>
+            <w:r>
+              <w:t xml:space="preserve">0.081</w:t>
+            </w:r>
+          </w:p>
+        </w:tc>
+        <w:tc>
+          <w:tcPr>
+            <w:tcW w:w="1170" w:type="dxa"/>
+          </w:tcPr>
+          <w:p>
+            <w:pPr/>
+            <w:r>
+              <w:t xml:space="preserve">7.64–7.89</w:t>
+            </w:r>
+          </w:p>
+        </w:tc>
+        <w:tc>
+          <w:tcPr>
+            <w:tcW w:w="1170" w:type="dxa"/>
+          </w:tcPr>
+          <w:p>
+            <w:pPr/>
+            <w:r>
+              <w:t xml:space="preserve">95.0 ± 0.8 %</w:t>
+            </w:r>
+          </w:p>
+        </w:tc>
+        <w:tc>
+          <w:tcPr>
+            <w:tcW w:w="1170" w:type="dxa"/>
+          </w:tcPr>
+          <w:p>
+            <w:pPr/>
+            <w:r>
+              <w:t xml:space="preserve">92.7 %</w:t>
+            </w:r>
+          </w:p>
+        </w:tc>
+        <w:tc>
+          <w:tcPr>
+            <w:tcW w:w="1170" w:type="dxa"/>
+          </w:tcPr>
+          <w:p>
+            <w:pPr/>
+            <w:r>
+              <w:t xml:space="preserve">49 % [42, 55]</w:t>
+            </w:r>
+          </w:p>
+        </w:tc>
+      </w:tr>
+      <w:tr>
+        <w:tc>
+          <w:tcPr>
+            <w:tcW w:w="1170" w:type="dxa"/>
+          </w:tcPr>
+          <w:p>
+            <w:pPr/>
+            <w:r>
+              <w:t xml:space="preserve">A</w:t>
+            </w:r>
+          </w:p>
+        </w:tc>
+        <w:tc>
+          <w:tcPr>
+            <w:tcW w:w="1170" w:type="dxa"/>
+          </w:tcPr>
+          <w:p>
+            <w:pPr/>
+            <w:r>
+              <w:t xml:space="preserve">Risk-averse</w:t>
+            </w:r>
+          </w:p>
+        </w:tc>
+        <w:tc>
+          <w:tcPr>
+            <w:tcW w:w="1170" w:type="dxa"/>
+          </w:tcPr>
+          <w:p>
+            <w:pPr/>
+            <w:r>
+              <w:t xml:space="preserve">7.765 [7.754, 7.776]</w:t>
+            </w:r>
+          </w:p>
+        </w:tc>
+        <w:tc>
+          <w:tcPr>
+            <w:tcW w:w="1170" w:type="dxa"/>
+          </w:tcPr>
+          <w:p>
+            <w:pPr/>
+            <w:r>
+              <w:t xml:space="preserve">0.079</w:t>
+            </w:r>
+          </w:p>
+        </w:tc>
+        <w:tc>
+          <w:tcPr>
+            <w:tcW w:w="1170" w:type="dxa"/>
+          </w:tcPr>
+          <w:p>
+            <w:pPr/>
+            <w:r>
+              <w:t xml:space="preserve">7.65–7.89</w:t>
+            </w:r>
+          </w:p>
+        </w:tc>
+        <w:tc>
+          <w:tcPr>
+            <w:tcW w:w="1170" w:type="dxa"/>
+          </w:tcPr>
+          <w:p>
+            <w:pPr/>
+            <w:r>
+              <w:t xml:space="preserve">95.0 ± 0.8 %</w:t>
+            </w:r>
+          </w:p>
+        </w:tc>
+        <w:tc>
+          <w:tcPr>
+            <w:tcW w:w="1170" w:type="dxa"/>
+          </w:tcPr>
+          <w:p>
+            <w:pPr/>
+            <w:r>
+              <w:t xml:space="preserve">92.7 %</w:t>
+            </w:r>
+          </w:p>
+        </w:tc>
+        <w:tc>
+          <w:tcPr>
+            <w:tcW w:w="1170" w:type="dxa"/>
+          </w:tcPr>
+          <w:p>
+            <w:pPr/>
+            <w:r>
+              <w:t xml:space="preserve">50 % [43, 57]</w:t>
+            </w:r>
+          </w:p>
+        </w:tc>
+      </w:tr>
+      <w:tr>
+        <w:tc>
+          <w:tcPr>
+            <w:tcW w:w="1170" w:type="dxa"/>
+          </w:tcPr>
+          <w:p>
+            <w:pPr/>
+            <w:r>
+              <w:t xml:space="preserve">B</w:t>
+            </w:r>
+          </w:p>
+        </w:tc>
+        <w:tc>
+          <w:tcPr>
+            <w:tcW w:w="1170" w:type="dxa"/>
+          </w:tcPr>
+          <w:p>
+            <w:pPr/>
+            <w:r>
+              <w:t xml:space="preserve">Deterministic</w:t>
+            </w:r>
+          </w:p>
+        </w:tc>
+        <w:tc>
+          <w:tcPr>
+            <w:tcW w:w="1170" w:type="dxa"/>
+          </w:tcPr>
+          <w:p>
+            <w:pPr/>
+            <w:r>
+              <w:t xml:space="preserve">7.902 [7.888, 7.915]</w:t>
+            </w:r>
+          </w:p>
+        </w:tc>
+        <w:tc>
+          <w:tcPr>
+            <w:tcW w:w="1170" w:type="dxa"/>
+          </w:tcPr>
+          <w:p>
+            <w:pPr/>
+            <w:r>
+              <w:t xml:space="preserve">0.098</w:t>
+            </w:r>
+          </w:p>
+        </w:tc>
+        <w:tc>
+          <w:tcPr>
+            <w:tcW w:w="1170" w:type="dxa"/>
+          </w:tcPr>
+          <w:p>
+            <w:pPr/>
+            <w:r>
+              <w:t xml:space="preserve">7.74–8.07</w:t>
+            </w:r>
+          </w:p>
+        </w:tc>
+        <w:tc>
+          <w:tcPr>
+            <w:tcW w:w="1170" w:type="dxa"/>
+          </w:tcPr>
+          <w:p>
+            <w:pPr/>
+            <w:r>
+              <w:t xml:space="preserve">94.8 ± 1.0 %</w:t>
+            </w:r>
+          </w:p>
+        </w:tc>
+        <w:tc>
+          <w:tcPr>
+            <w:tcW w:w="1170" w:type="dxa"/>
+          </w:tcPr>
+          <w:p>
+            <w:pPr/>
+            <w:r>
+              <w:t xml:space="preserve">92.0 %</w:t>
+            </w:r>
+          </w:p>
+        </w:tc>
+        <w:tc>
+          <w:tcPr>
+            <w:tcW w:w="1170" w:type="dxa"/>
+          </w:tcPr>
+          <w:p>
+            <w:pPr/>
+            <w:r>
+              <w:t xml:space="preserve">42 % [35, 49]</w:t>
+            </w:r>
+          </w:p>
+        </w:tc>
+      </w:tr>
+      <w:tr>
+        <w:tc>
+          <w:tcPr>
+            <w:tcW w:w="1170" w:type="dxa"/>
+          </w:tcPr>
+          <w:p>
+            <w:pPr/>
+            <w:r>
+              <w:t xml:space="preserve">B</w:t>
+            </w:r>
+          </w:p>
+        </w:tc>
+        <w:tc>
+          <w:tcPr>
+            <w:tcW w:w="1170" w:type="dxa"/>
+          </w:tcPr>
+          <w:p>
+            <w:pPr/>
+            <w:r>
+              <w:t xml:space="preserve">Risk-neutral</w:t>
+            </w:r>
+          </w:p>
+        </w:tc>
+        <w:tc>
+          <w:tcPr>
+            <w:tcW w:w="1170" w:type="dxa"/>
+          </w:tcPr>
+          <w:p>
+            <w:pPr/>
+            <w:r>
+              <w:t xml:space="preserve">8.099 [8.086, 8.112]</w:t>
+            </w:r>
+          </w:p>
+        </w:tc>
+        <w:tc>
+          <w:tcPr>
+            <w:tcW w:w="1170" w:type="dxa"/>
+          </w:tcPr>
+          <w:p>
+            <w:pPr/>
+            <w:r>
+              <w:t xml:space="preserve">0.092</w:t>
+            </w:r>
+          </w:p>
+        </w:tc>
+        <w:tc>
+          <w:tcPr>
+            <w:tcW w:w="1170" w:type="dxa"/>
+          </w:tcPr>
+          <w:p>
+            <w:pPr/>
+            <w:r>
+              <w:t xml:space="preserve">7.95–8.25</w:t>
+            </w:r>
+          </w:p>
+        </w:tc>
+        <w:tc>
+          <w:tcPr>
+            <w:tcW w:w="1170" w:type="dxa"/>
+          </w:tcPr>
+          <w:p>
+            <w:pPr/>
+            <w:r>
+              <w:t xml:space="preserve">95.7 ± 0.9 %</w:t>
+            </w:r>
+          </w:p>
+        </w:tc>
+        <w:tc>
+          <w:tcPr>
+            <w:tcW w:w="1170" w:type="dxa"/>
+          </w:tcPr>
+          <w:p>
+            <w:pPr/>
+            <w:r>
+              <w:t xml:space="preserve">93.0 %</w:t>
+            </w:r>
+          </w:p>
+        </w:tc>
+        <w:tc>
+          <w:tcPr>
+            <w:tcW w:w="1170" w:type="dxa"/>
+          </w:tcPr>
+          <w:p>
+            <w:pPr/>
+            <w:r>
+              <w:t xml:space="preserve">78 % [71, 83]</w:t>
+            </w:r>
+          </w:p>
+        </w:tc>
+      </w:tr>
+      <w:tr>
+        <w:tc>
+          <w:tcPr>
+            <w:tcW w:w="1170" w:type="dxa"/>
+          </w:tcPr>
+          <w:p>
+            <w:pPr/>
+            <w:r>
+              <w:t xml:space="preserve">B</w:t>
+            </w:r>
+          </w:p>
+        </w:tc>
+        <w:tc>
+          <w:tcPr>
+            <w:tcW w:w="1170" w:type="dxa"/>
+          </w:tcPr>
+          <w:p>
+            <w:pPr/>
+            <w:r>
+              <w:t xml:space="preserve">Risk-averse</w:t>
+            </w:r>
+          </w:p>
+        </w:tc>
+        <w:tc>
+          <w:tcPr>
+            <w:tcW w:w="1170" w:type="dxa"/>
+          </w:tcPr>
+          <w:p>
+            <w:pPr/>
+            <w:r>
+              <w:t xml:space="preserve">8.111 [8.098, 8.123]</w:t>
+            </w:r>
+          </w:p>
+        </w:tc>
+        <w:tc>
+          <w:tcPr>
+            <w:tcW w:w="1170" w:type="dxa"/>
+          </w:tcPr>
+          <w:p>
+            <w:pPr/>
+            <w:r>
+              <w:t xml:space="preserve">0.089</w:t>
+            </w:r>
+          </w:p>
+        </w:tc>
+        <w:tc>
+          <w:tcPr>
+            <w:tcW w:w="1170" w:type="dxa"/>
+          </w:tcPr>
+          <w:p>
+            <w:pPr/>
+            <w:r>
+              <w:t xml:space="preserve">7.96–8.26</w:t>
+            </w:r>
+          </w:p>
+        </w:tc>
+        <w:tc>
+          <w:tcPr>
+            <w:tcW w:w="1170" w:type="dxa"/>
+          </w:tcPr>
+          <w:p>
+            <w:pPr/>
+            <w:r>
+              <w:t xml:space="preserve">95.6 ± 0.9 %</w:t>
+            </w:r>
+          </w:p>
+        </w:tc>
+        <w:tc>
+          <w:tcPr>
+            <w:tcW w:w="1170" w:type="dxa"/>
+          </w:tcPr>
+          <w:p>
+            <w:pPr/>
+            <w:r>
+              <w:t xml:space="preserve">93.1 %</w:t>
+            </w:r>
+          </w:p>
+        </w:tc>
+        <w:tc>
+          <w:tcPr>
+            <w:tcW w:w="1170" w:type="dxa"/>
+          </w:tcPr>
+          <w:p>
+            <w:pPr/>
+            <w:r>
+              <w:t xml:space="preserve">76 % [70, 81]</w:t>
+            </w:r>
+          </w:p>
+        </w:tc>
+      </w:tr>
+    </w:tbl>
+    <w:p>
+      <w:pPr/>
+      <w:r>
+        <w:t xml:space="preserve">The non-overlapping Wilson intervals already separate deterministic from stochastic designs. Paired tests make it exact:</w:t>
+      </w:r>
+    </w:p>
+    <w:tbl>
+      <w:tblPr>
+        <w:tblStyle w:val="TableGrid"/>
+        <w:tblW w:w="0" w:type="auto"/>
+        <w:tblLayout w:type="fixed"/>
+        <w:tblLook w:val="04A0" w:firstRow="1" w:lastRow="0" w:firstColumn="0" w:lastColumn="0" w:noHBand="0" w:noVBand="1"/>
+      </w:tblPr>
+      <w:tblGrid>
+        <w:gridCol w:w="1170"/>
+        <w:gridCol w:w="1170"/>
+        <w:gridCol w:w="1170"/>
+        <w:gridCol w:w="1170"/>
+        <w:gridCol w:w="1170"/>
+        <w:gridCol w:w="1170"/>
+        <w:gridCol w:w="1170"/>
+        <w:gridCol w:w="1170"/>
+      </w:tblGrid>
+      <w:tr>
+        <w:trPr>
+          <w:tblHeader/>
+        </w:trPr>
+        <w:tc>
+          <w:tcPr>
+            <w:tcW w:w="1170" w:type="dxa"/>
+            <w:shd w:val="clear" w:color="auto" w:fill="F2F2F2"/>
+          </w:tcPr>
+          <w:p>
+            <w:pPr/>
+            <w:r>
+              <w:t xml:space="preserve">Site</w:t>
+            </w:r>
+          </w:p>
+        </w:tc>
+        <w:tc>
+          <w:tcPr>
+            <w:tcW w:w="1170" w:type="dxa"/>
+            <w:shd w:val="clear" w:color="auto" w:fill="F2F2F2"/>
+          </w:tcPr>
+          <w:p>
+            <w:pPr/>
+            <w:r>
+              <w:t xml:space="preserve">Stochastic vs deterministic</w:t>
+            </w:r>
+          </w:p>
+        </w:tc>
+        <w:tc>
+          <w:tcPr>
+            <w:tcW w:w="1170" w:type="dxa"/>
+            <w:shd w:val="clear" w:color="auto" w:fill="F2F2F2"/>
+          </w:tcPr>
+          <w:p>
+            <w:pPr/>
+            <w:r>
+              <w:t xml:space="preserve">Δ LCOH (USD/kg, %)</w:t>
+            </w:r>
+          </w:p>
+        </w:tc>
+        <w:tc>
+          <w:tcPr>
+            <w:tcW w:w="1170" w:type="dxa"/>
+            <w:shd w:val="clear" w:color="auto" w:fill="F2F2F2"/>
+          </w:tcPr>
+          <w:p>
+            <w:pPr/>
+            <w:r>
+              <w:t xml:space="preserve">Wilcoxon p (LCOH)</w:t>
+            </w:r>
+          </w:p>
+        </w:tc>
+        <w:tc>
+          <w:tcPr>
+            <w:tcW w:w="1170" w:type="dxa"/>
+            <w:shd w:val="clear" w:color="auto" w:fill="F2F2F2"/>
+          </w:tcPr>
+          <w:p>
+            <w:pPr/>
+            <w:r>
+              <w:t xml:space="preserve">Δ reliability (pp)</w:t>
+            </w:r>
+          </w:p>
+        </w:tc>
+        <w:tc>
+          <w:tcPr>
+            <w:tcW w:w="1170" w:type="dxa"/>
+            <w:shd w:val="clear" w:color="auto" w:fill="F2F2F2"/>
+          </w:tcPr>
+          <w:p>
+            <w:pPr/>
+            <w:r>
+              <w:t xml:space="preserve">Cohen's d (reliability)</w:t>
+            </w:r>
+          </w:p>
+        </w:tc>
+        <w:tc>
+          <w:tcPr>
+            <w:tcW w:w="1170" w:type="dxa"/>
+            <w:shd w:val="clear" w:color="auto" w:fill="F2F2F2"/>
+          </w:tcPr>
+          <w:p>
+            <w:pPr/>
+            <w:r>
+              <w:t xml:space="preserve">Years only stochastic compliant / only deterministic compliant</w:t>
+            </w:r>
+          </w:p>
+        </w:tc>
+        <w:tc>
+          <w:tcPr>
+            <w:tcW w:w="1170" w:type="dxa"/>
+            <w:shd w:val="clear" w:color="auto" w:fill="F2F2F2"/>
+          </w:tcPr>
+          <w:p>
+            <w:pPr/>
+            <w:r>
+              <w:t xml:space="preserve">McNemar exact p</w:t>
+            </w:r>
+          </w:p>
+        </w:tc>
+      </w:tr>
+      <w:tr>
+        <w:tc>
+          <w:tcPr>
+            <w:tcW w:w="1170" w:type="dxa"/>
+          </w:tcPr>
+          <w:p>
+            <w:pPr/>
+            <w:r>
+              <w:t xml:space="preserve">A</w:t>
+            </w:r>
+          </w:p>
+        </w:tc>
+        <w:tc>
+          <w:tcPr>
+            <w:tcW w:w="1170" w:type="dxa"/>
+          </w:tcPr>
+          <w:p>
+            <w:pPr/>
+            <w:r>
+              <w:t xml:space="preserve">Risk-neutral</w:t>
+            </w:r>
+          </w:p>
+        </w:tc>
+        <w:tc>
+          <w:tcPr>
+            <w:tcW w:w="1170" w:type="dxa"/>
+          </w:tcPr>
+          <w:p>
+            <w:pPr/>
+            <w:r>
+              <w:t xml:space="preserve">+0.080 (+1.0 %)</w:t>
+            </w:r>
+          </w:p>
+        </w:tc>
+        <w:tc>
+          <w:tcPr>
+            <w:tcW w:w="1170" w:type="dxa"/>
+          </w:tcPr>
+          <w:p>
+            <w:pPr/>
+            <w:r>
+              <w:t xml:space="preserve">&lt; 10⁻³⁰</w:t>
+            </w:r>
+          </w:p>
+        </w:tc>
+        <w:tc>
+          <w:tcPr>
+            <w:tcW w:w="1170" w:type="dxa"/>
+          </w:tcPr>
+          <w:p>
+            <w:pPr/>
+            <w:r>
+              <w:t xml:space="preserve">+0.36</w:t>
+            </w:r>
+          </w:p>
+        </w:tc>
+        <w:tc>
+          <w:tcPr>
+            <w:tcW w:w="1170" w:type="dxa"/>
+          </w:tcPr>
+          <w:p>
+            <w:pPr/>
+            <w:r>
+              <w:t xml:space="preserve">6.4</w:t>
+            </w:r>
+          </w:p>
+        </w:tc>
+        <w:tc>
+          <w:tcPr>
+            <w:tcW w:w="1170" w:type="dxa"/>
+          </w:tcPr>
+          <w:p>
+            <w:pPr/>
+            <w:r>
+              <w:t xml:space="preserve">33 / 0</w:t>
+            </w:r>
+          </w:p>
+        </w:tc>
+        <w:tc>
+          <w:tcPr>
+            <w:tcW w:w="1170" w:type="dxa"/>
+          </w:tcPr>
+          <w:p>
+            <w:pPr/>
+            <w:r>
+              <w:t xml:space="preserve">2.3 × 10⁻¹⁰</w:t>
+            </w:r>
+          </w:p>
+        </w:tc>
+      </w:tr>
+      <w:tr>
+        <w:tc>
+          <w:tcPr>
+            <w:tcW w:w="1170" w:type="dxa"/>
+          </w:tcPr>
+          <w:p>
+            <w:pPr/>
+            <w:r>
+              <w:t xml:space="preserve">A</w:t>
+            </w:r>
+          </w:p>
+        </w:tc>
+        <w:tc>
+          <w:tcPr>
+            <w:tcW w:w="1170" w:type="dxa"/>
+          </w:tcPr>
+          <w:p>
+            <w:pPr/>
+            <w:r>
+              <w:t xml:space="preserve">Risk-averse</w:t>
+            </w:r>
+          </w:p>
+        </w:tc>
+        <w:tc>
+          <w:tcPr>
+            <w:tcW w:w="1170" w:type="dxa"/>
+          </w:tcPr>
+          <w:p>
+            <w:pPr/>
+            <w:r>
+              <w:t xml:space="preserve">+0.077 (+1.0 %)</w:t>
+            </w:r>
+          </w:p>
+        </w:tc>
+        <w:tc>
+          <w:tcPr>
+            <w:tcW w:w="1170" w:type="dxa"/>
+          </w:tcPr>
+          <w:p>
+            <w:pPr/>
+            <w:r>
+              <w:t xml:space="preserve">&lt; 10⁻³⁰</w:t>
+            </w:r>
+          </w:p>
+        </w:tc>
+        <w:tc>
+          <w:tcPr>
+            <w:tcW w:w="1170" w:type="dxa"/>
+          </w:tcPr>
+          <w:p>
+            <w:pPr/>
+            <w:r>
+              <w:t xml:space="preserve">+0.40</w:t>
+            </w:r>
+          </w:p>
+        </w:tc>
+        <w:tc>
+          <w:tcPr>
+            <w:tcW w:w="1170" w:type="dxa"/>
+          </w:tcPr>
+          <w:p>
+            <w:pPr/>
+            <w:r>
+              <w:t xml:space="preserve">5.3</w:t>
+            </w:r>
+          </w:p>
+        </w:tc>
+        <w:tc>
+          <w:tcPr>
+            <w:tcW w:w="1170" w:type="dxa"/>
+          </w:tcPr>
+          <w:p>
+            <w:pPr/>
+            <w:r>
+              <w:t xml:space="preserve">36 / 0</w:t>
+            </w:r>
+          </w:p>
+        </w:tc>
+        <w:tc>
+          <w:tcPr>
+            <w:tcW w:w="1170" w:type="dxa"/>
+          </w:tcPr>
+          <w:p>
+            <w:pPr/>
+            <w:r>
+              <w:t xml:space="preserve">2.9 × 10⁻¹¹</w:t>
+            </w:r>
+          </w:p>
+        </w:tc>
+      </w:tr>
+      <w:tr>
+        <w:tc>
+          <w:tcPr>
+            <w:tcW w:w="1170" w:type="dxa"/>
+          </w:tcPr>
+          <w:p>
+            <w:pPr/>
+            <w:r>
+              <w:t xml:space="preserve">B</w:t>
+            </w:r>
+          </w:p>
+        </w:tc>
+        <w:tc>
+          <w:tcPr>
+            <w:tcW w:w="1170" w:type="dxa"/>
+          </w:tcPr>
+          <w:p>
+            <w:pPr/>
+            <w:r>
+              <w:t xml:space="preserve">Risk-neutral</w:t>
+            </w:r>
+          </w:p>
+        </w:tc>
+        <w:tc>
+          <w:tcPr>
+            <w:tcW w:w="1170" w:type="dxa"/>
+          </w:tcPr>
+          <w:p>
+            <w:pPr/>
+            <w:r>
+              <w:t xml:space="preserve">+0.197 (+2.5 %)</w:t>
+            </w:r>
+          </w:p>
+        </w:tc>
+        <w:tc>
+          <w:tcPr>
+            <w:tcW w:w="1170" w:type="dxa"/>
+          </w:tcPr>
+          <w:p>
+            <w:pPr/>
+            <w:r>
+              <w:t xml:space="preserve">&lt; 10⁻³⁰</w:t>
+            </w:r>
+          </w:p>
+        </w:tc>
+        <w:tc>
+          <w:tcPr>
+            <w:tcW w:w="1170" w:type="dxa"/>
+          </w:tcPr>
+          <w:p>
+            <w:pPr/>
+            <w:r>
+              <w:t xml:space="preserve">+0.91</w:t>
+            </w:r>
+          </w:p>
+        </w:tc>
+        <w:tc>
+          <w:tcPr>
+            <w:tcW w:w="1170" w:type="dxa"/>
+          </w:tcPr>
+          <w:p>
+            <w:pPr/>
+            <w:r>
+              <w:t xml:space="preserve">6.6</w:t>
+            </w:r>
+          </w:p>
+        </w:tc>
+        <w:tc>
+          <w:tcPr>
+            <w:tcW w:w="1170" w:type="dxa"/>
+          </w:tcPr>
+          <w:p>
+            <w:pPr/>
+            <w:r>
+              <w:t xml:space="preserve">71 / 0</w:t>
+            </w:r>
+          </w:p>
+        </w:tc>
+        <w:tc>
+          <w:tcPr>
+            <w:tcW w:w="1170" w:type="dxa"/>
+          </w:tcPr>
+          <w:p>
+            <w:pPr/>
+            <w:r>
+              <w:t xml:space="preserve">8.5 × 10⁻²²</w:t>
+            </w:r>
+          </w:p>
+        </w:tc>
+      </w:tr>
+      <w:tr>
+        <w:tc>
+          <w:tcPr>
+            <w:tcW w:w="1170" w:type="dxa"/>
+          </w:tcPr>
+          <w:p>
+            <w:pPr/>
+            <w:r>
+              <w:t xml:space="preserve">B</w:t>
+            </w:r>
+          </w:p>
+        </w:tc>
+        <w:tc>
+          <w:tcPr>
+            <w:tcW w:w="1170" w:type="dxa"/>
+          </w:tcPr>
+          <w:p>
+            <w:pPr/>
+            <w:r>
+              <w:t xml:space="preserve">Risk-averse</w:t>
+            </w:r>
+          </w:p>
+        </w:tc>
+        <w:tc>
+          <w:tcPr>
+            <w:tcW w:w="1170" w:type="dxa"/>
+          </w:tcPr>
+          <w:p>
+            <w:pPr/>
+            <w:r>
+              <w:t xml:space="preserve">+0.209 (+2.6 %)</w:t>
+            </w:r>
+          </w:p>
+        </w:tc>
+        <w:tc>
+          <w:tcPr>
+            <w:tcW w:w="1170" w:type="dxa"/>
+          </w:tcPr>
+          <w:p>
+            <w:pPr/>
+            <w:r>
+              <w:t xml:space="preserve">&lt; 10⁻³⁰</w:t>
+            </w:r>
+          </w:p>
+        </w:tc>
+        <w:tc>
+          <w:tcPr>
+            <w:tcW w:w="1170" w:type="dxa"/>
+          </w:tcPr>
+          <w:p>
+            <w:pPr/>
+            <w:r>
+              <w:t xml:space="preserve">+0.83</w:t>
+            </w:r>
+          </w:p>
+        </w:tc>
+        <w:tc>
+          <w:tcPr>
+            <w:tcW w:w="1170" w:type="dxa"/>
+          </w:tcPr>
+          <w:p>
+            <w:pPr/>
+            <w:r>
+              <w:t xml:space="preserve">5.3</w:t>
+            </w:r>
+          </w:p>
+        </w:tc>
+        <w:tc>
+          <w:tcPr>
+            <w:tcW w:w="1170" w:type="dxa"/>
+          </w:tcPr>
+          <w:p>
+            <w:pPr/>
+            <w:r>
+              <w:t xml:space="preserve">68 / 0</w:t>
+            </w:r>
+          </w:p>
+        </w:tc>
+        <w:tc>
+          <w:tcPr>
+            <w:tcW w:w="1170" w:type="dxa"/>
+          </w:tcPr>
+          <w:p>
+            <w:pPr/>
+            <w:r>
+              <w:t xml:space="preserve">6.8 × 10⁻²¹</w:t>
+            </w:r>
+          </w:p>
+        </w:tc>
+      </w:tr>
+    </w:tbl>
+    <w:p>
+      <w:pPr/>
+      <w:r>
+        <w:t xml:space="preserve">The stochastic design dominates the deterministic one year by year: no year is compliant under the deterministic design alone, so the discordant counts are one-sided, and the paired reliability gains are large relative to their spread (Cohen's d &gt; 5). The LCOH premium is equally systematic — it is positive in all 200 years, which is why the Wilcoxon p-value reaches its floor (1.4 × 10⁻³⁴). The cost of this dominance is a near-deterministic shift of 1–2.6 % in LCOH, with a year-to-year LCOH spread (SD 0.08–0.10 USD/kg) that is similar for all designs. Note that the confidence intervals describe Monte Carlo sampling of weather; they do not include model or cost uncertainty, which Section 7.6 treats.</w:t>
+      </w:r>
+    </w:p>
+    <w:p>
+      <w:pPr/>
+      <w:r>
+        <w:t xml:space="preserve">At 200 years, the 95 % Wilson half-width on compliance is about ±7 percentage points, so differences of a few points between risk-neutral and risk-averse designs (49 vs 50 %, 78 vs 76 %) are not meaningful — confirming statistically that CVaR adds nothing here.</w:t>
+      </w:r>
+    </w:p>
+    <w:p>
+      <w:pPr>
+        <w:pStyle w:val="Heading3"/>
+      </w:pPr>
+      <w:r>
+        <w:t xml:space="preserve">7.5 Seasonal shortfall analysis</w:t>
+      </w:r>
+    </w:p>
+    <w:p>
+      <w:pPr/>
+      <w:r>
+        <w:t xml:space="preserve">November to February account for 97–99 % of all unmet hydrogen at both sites, and an annual reliability target hides a severe mid-winter deficit.</w:t>
+      </w:r>
+    </w:p>
+    <w:p>
+      <w:pPr/>
+      <w:r>
+        <w:drawing>
+          <wp:inline distT="0" distB="0" distL="0" distR="0">
+            <wp:extent cx="5486400" cy="2506435"/>
+            <wp:docPr id="6" name="image6" descr="Fig. 6 · results/analysis_monthly_shortfall.csv · 200 bootstrap years"/>
+            <a:graphic xmlns:a="http://schemas.openxmlformats.org/drawingml/2006/main">
+              <a:graphicData uri="http://schemas.openxmlformats.org/drawingml/2006/picture">
+                <pic:pic xmlns:pic="http://schemas.openxmlformats.org/drawingml/2006/picture">
+                  <pic:nvPicPr>
+                    <pic:cNvPr id="6" name="image6" descr="Fig. 6 · results/analysis_monthly_shortfall.csv · 200 bootstrap years"/>
+                    <pic:cNvPicPr/>
+                  </pic:nvPicPr>
+                  <pic:blipFill>
+                    <a:blip r:embed="rId8"/>
+                    <a:stretch>
+                      <a:fillRect/>
+                    </a:stretch>
+                  </pic:blipFill>
+                  <pic:spPr>
+                    <a:xfrm>
+                      <a:off x="0" y="0"/>
+                      <a:ext cx="5486400" cy="2506435"/>
+                    </a:xfrm>
+                    <a:prstGeom prst="rect">
+                      <a:avLst/>
+                    </a:prstGeom>
+                  </pic:spPr>
+                </pic:pic>
+              </a:graphicData>
+            </a:graphic>
+          </wp:inline>
+        </w:drawing>
+      </w:r>
+    </w:p>
+    <w:p>
+      <w:pPr/>
+      <w:r>
+        <w:t xml:space="preserve">Fig. 6 · results/analysis_monthly_shortfall.csv · 200 bootstrap years</w:t>
+      </w:r>
+    </w:p>
+    <w:p>
+      <w:pPr/>
+      <w:r>
+        <w:t xml:space="preserve">The risk-neutral designs reduce shortfall most in the shoulder months (site B: November −27 %, October −87 %) but barely touch January, when the day is short and the sun low. Even the stochastic design at site A leaves about a third of January demand to backup supply. Three design implications follow: (i) an annual reliability metric can mislead — a monthly or seasonal constraint would expose the January gap; (ii) meeting winter demand on site would need seasonal hydrogen storage (salt caverns, pipelines or lined rock caverns) rather than more daily tank capacity, because the tank is full every summer afternoon (Section 6.4); (iii) for small off-grid plants, a contracted winter backup supply is a legitimate, cheaper design element. The monthly sums are slightly below the annual shortfall in Table 7.4 because the end-of-year tank refill is not assigned to a month.</w:t>
+      </w:r>
+    </w:p>
+    <w:p>
+      <w:pPr>
+        <w:pStyle w:val="Heading3"/>
+      </w:pPr>
+      <w:r>
+        <w:t xml:space="preserve">7.6 Global sensitivity and variance decomposition</w:t>
+      </w:r>
+    </w:p>
+    <w:p>
+      <w:pPr/>
+      <w:r>
+        <w:t xml:space="preserve">Cost assumptions, not weather, dominate the uncertainty in LCOH: across plausible cost ranges LCOH spans about 3 USD/kg, while year-to-year weather moves it by less than 0.1 USD/kg.</w:t>
+      </w:r>
+    </w:p>
+    <w:p>
+      <w:pPr/>
+      <w:r>
+        <w:t xml:space="preserve">The one-at-a-time analysis of Section 6.4 was extended to a global analysis. Seven inputs were sampled jointly by Latin hypercube (2 000 samples): capital costs of PV, electrolyser, battery and tank, the discount rate and the backup price (each ±30 %), and the water price (×0.5–×2). For each sample the risk-neutral design was costed on all 200 bootstrap years, giving a 2 000 × 200 matrix of LCOH. Standardised regression coefficients (SRC) of mean LCOH on the inputs explain 99.5 % of its variance (R² = 0.995 and 0.994), so the linear sensitivity measures are reliable; Spearman rank correlations give the same ranking.</w:t>
+      </w:r>
+    </w:p>
+    <w:p>
+      <w:pPr/>
+      <w:r>
+        <w:drawing>
+          <wp:inline distT="0" distB="0" distL="0" distR="0">
+            <wp:extent cx="5486400" cy="2726871"/>
+            <wp:docPr id="7" name="image7" descr="Fig. 8 · results/analysis_gsa.csv · regression R² = 0.995 (A), 0.994 (B)"/>
+            <a:graphic xmlns:a="http://schemas.openxmlformats.org/drawingml/2006/main">
+              <a:graphicData uri="http://schemas.openxmlformats.org/drawingml/2006/picture">
+                <pic:pic xmlns:pic="http://schemas.openxmlformats.org/drawingml/2006/picture">
+                  <pic:nvPicPr>
+                    <pic:cNvPr id="7" name="image7" descr="Fig. 8 · results/analysis_gsa.csv · regression R² = 0.995 (A), 0.994 (B)"/>
+                    <pic:cNvPicPr/>
+                  </pic:nvPicPr>
+                  <pic:blipFill>
+                    <a:blip r:embed="rId9"/>
+                    <a:stretch>
+                      <a:fillRect/>
+                    </a:stretch>
+                  </pic:blipFill>
+                  <pic:spPr>
+                    <a:xfrm>
+                      <a:off x="0" y="0"/>
+                      <a:ext cx="5486400" cy="2726871"/>
+                    </a:xfrm>
+                    <a:prstGeom prst="rect">
+                      <a:avLst/>
+                    </a:prstGeom>
+                  </pic:spPr>
+                </pic:pic>
+              </a:graphicData>
+            </a:graphic>
+          </wp:inline>
+        </w:drawing>
+      </w:r>
+    </w:p>
+    <w:p>
+      <w:pPr/>
+      <w:r>
+        <w:t xml:space="preserve">Fig. 8 · results/analysis_gsa.csv · regression R² = 0.995 (A), 0.994 (B)</w:t>
+      </w:r>
+    </w:p>
+    <w:p>
+      <w:pPr/>
+      <w:r>
+        <w:t xml:space="preserve">Electrolyser capital cost, discount rate and PV capital cost together account for 98.9 % (A) and 99.1 % (B) of the explained variance, almost equally. Battery, tank and water costs are negligible (&lt; 0.4 % each) — doubling the water price changes nothing, even at the arid site, which reframes the water–energy–hydrogen debate: for PEM electrolysis water availability is a permitting and sourcing issue, not a cost driver.</w:t>
+      </w:r>
+    </w:p>
+    <w:p>
+      <w:pPr/>
+      <w:r>
+        <w:rPr>
+          <w:b/>
+        </w:rPr>
+        <w:t xml:space="preserve">Weather versus economic uncertainty.</w:t>
+      </w:r>
+      <w:r>
+        <w:t xml:space="preserve"> By the law of total variance, Var(LCOH) = E_econ[Var_weather] + Var_econ[E_weather].</w:t>
+      </w:r>
+    </w:p>
+    <w:tbl>
+      <w:tblPr>
+        <w:tblStyle w:val="TableGrid"/>
+        <w:tblW w:w="0" w:type="auto"/>
+        <w:tblLayout w:type="fixed"/>
+        <w:tblLook w:val="04A0" w:firstRow="1" w:lastRow="0" w:firstColumn="0" w:lastColumn="0" w:noHBand="0" w:noVBand="1"/>
+      </w:tblPr>
+      <w:tblGrid>
+        <w:gridCol w:w="2340"/>
+        <w:gridCol w:w="2340"/>
+        <w:gridCol w:w="2340"/>
+        <w:gridCol w:w="2340"/>
+      </w:tblGrid>
+      <w:tr>
+        <w:trPr>
+          <w:tblHeader/>
+        </w:trPr>
+        <w:tc>
+          <w:tcPr>
+            <w:tcW w:w="2340" w:type="dxa"/>
+            <w:shd w:val="clear" w:color="auto" w:fill="F2F2F2"/>
+          </w:tcPr>
+          <w:p>
+            <w:pPr/>
+            <w:r>
+              <w:t xml:space="preserve">Site</w:t>
+            </w:r>
+          </w:p>
+        </w:tc>
+        <w:tc>
+          <w:tcPr>
+            <w:tcW w:w="2340" w:type="dxa"/>
+            <w:shd w:val="clear" w:color="auto" w:fill="F2F2F2"/>
+          </w:tcPr>
+          <w:p>
+            <w:pPr/>
+            <w:r>
+              <w:t xml:space="preserve">LCOH 5 % – 50 % – 95 % (USD/kg)</w:t>
+            </w:r>
+          </w:p>
+        </w:tc>
+        <w:tc>
+          <w:tcPr>
+            <w:tcW w:w="2340" w:type="dxa"/>
+            <w:shd w:val="clear" w:color="auto" w:fill="F2F2F2"/>
+          </w:tcPr>
+          <w:p>
+            <w:pPr/>
+            <w:r>
+              <w:t xml:space="preserve">Share of variance from weather (between years)</w:t>
+            </w:r>
+          </w:p>
+        </w:tc>
+        <w:tc>
+          <w:tcPr>
+            <w:tcW w:w="2340" w:type="dxa"/>
+            <w:shd w:val="clear" w:color="auto" w:fill="F2F2F2"/>
+          </w:tcPr>
+          <w:p>
+            <w:pPr/>
+            <w:r>
+              <w:t xml:space="preserve">Share from economic inputs</w:t>
+            </w:r>
+          </w:p>
+        </w:tc>
+      </w:tr>
+      <w:tr>
+        <w:tc>
+          <w:tcPr>
+            <w:tcW w:w="2340" w:type="dxa"/>
+          </w:tcPr>
+          <w:p>
+            <w:pPr/>
+            <w:r>
+              <w:t xml:space="preserve">A, semi-arid</w:t>
+            </w:r>
+          </w:p>
+        </w:tc>
+        <w:tc>
+          <w:tcPr>
+            <w:tcW w:w="2340" w:type="dxa"/>
+          </w:tcPr>
+          <w:p>
+            <w:pPr/>
+            <w:r>
+              <w:t xml:space="preserve">6.34 – 7.74 – 9.43</w:t>
+            </w:r>
+          </w:p>
+        </w:tc>
+        <w:tc>
+          <w:tcPr>
+            <w:tcW w:w="2340" w:type="dxa"/>
+          </w:tcPr>
+          <w:p>
+            <w:pPr/>
+            <w:r>
+              <w:t xml:space="preserve">0.8 %</w:t>
+            </w:r>
+          </w:p>
+        </w:tc>
+        <w:tc>
+          <w:tcPr>
+            <w:tcW w:w="2340" w:type="dxa"/>
+          </w:tcPr>
+          <w:p>
+            <w:pPr/>
+            <w:r>
+              <w:t xml:space="preserve">99.2 %</w:t>
+            </w:r>
+          </w:p>
+        </w:tc>
+      </w:tr>
+      <w:tr>
+        <w:tc>
+          <w:tcPr>
+            <w:tcW w:w="2340" w:type="dxa"/>
+          </w:tcPr>
+          <w:p>
+            <w:pPr/>
+            <w:r>
+              <w:t xml:space="preserve">B, humid</w:t>
+            </w:r>
+          </w:p>
+        </w:tc>
+        <w:tc>
+          <w:tcPr>
+            <w:tcW w:w="2340" w:type="dxa"/>
+          </w:tcPr>
+          <w:p>
+            <w:pPr/>
+            <w:r>
+              <w:t xml:space="preserve">6.60 – 8.07 – 9.84</w:t>
+            </w:r>
+          </w:p>
+        </w:tc>
+        <w:tc>
+          <w:tcPr>
+            <w:tcW w:w="2340" w:type="dxa"/>
+          </w:tcPr>
+          <w:p>
+            <w:pPr/>
+            <w:r>
+              <w:t xml:space="preserve">0.9 %</w:t>
+            </w:r>
+          </w:p>
+        </w:tc>
+        <w:tc>
+          <w:tcPr>
+            <w:tcW w:w="2340" w:type="dxa"/>
+          </w:tcPr>
+          <w:p>
+            <w:pPr/>
+            <w:r>
+              <w:t xml:space="preserve">99.1 %</w:t>
+            </w:r>
+          </w:p>
+        </w:tc>
+      </w:tr>
+    </w:tbl>
+    <w:p>
+      <w:pPr/>
+      <w:r>
+        <w:t xml:space="preserve">For a fixed design, weather moves the cost very little; its effect falls almost entirely on reliability, which the backup purchase absorbs. Two practical consequences follow. First, the purpose of weather scenarios in hydrogen planning is to size for reliability, not to forecast cost. Second, policy levers that cut the cost of capital (green-finance instruments, de-risking guarantees) are as powerful as a 30 % fall in electrolyser prices.</w:t>
+      </w:r>
+    </w:p>
+    <w:p>
+      <w:pPr>
+        <w:pStyle w:val="Heading3"/>
+      </w:pPr>
+      <w:r>
+        <w:t xml:space="preserve">7.7 Cost–reliability trade-off</w:t>
+      </w:r>
+    </w:p>
+    <w:p>
+      <w:pPr/>
+      <w:r>
+        <w:t xml:space="preserve">The GA was re-run for reliability targets of 80, 90, 95, 97 and 99 % (chance level 0.9) to trace the price of reliability.</w:t>
+      </w:r>
+    </w:p>
+    <w:p>
+      <w:pPr/>
+      <w:r>
+        <w:drawing>
+          <wp:inline distT="0" distB="0" distL="0" distR="0">
+            <wp:extent cx="5486400" cy="2506435"/>
+            <wp:docPr id="8" name="image8" descr="Fig. 7 · results/analysis_tradeoff.csv · risk-neutral GA, chance level 0.9"/>
+            <a:graphic xmlns:a="http://schemas.openxmlformats.org/drawingml/2006/main">
+              <a:graphicData uri="http://schemas.openxmlformats.org/drawingml/2006/picture">
+                <pic:pic xmlns:pic="http://schemas.openxmlformats.org/drawingml/2006/picture">
+                  <pic:nvPicPr>
+                    <pic:cNvPr id="8" name="image8" descr="Fig. 7 · results/analysis_tradeoff.csv · risk-neutral GA, chance level 0.9"/>
+                    <pic:cNvPicPr/>
+                  </pic:nvPicPr>
+                  <pic:blipFill>
+                    <a:blip r:embed="rId10"/>
+                    <a:stretch>
+                      <a:fillRect/>
+                    </a:stretch>
+                  </pic:blipFill>
+                  <pic:spPr>
+                    <a:xfrm>
+                      <a:off x="0" y="0"/>
+                      <a:ext cx="5486400" cy="2506435"/>
+                    </a:xfrm>
+                    <a:prstGeom prst="rect">
+                      <a:avLst/>
+                    </a:prstGeom>
+                  </pic:spPr>
+                </pic:pic>
+              </a:graphicData>
+            </a:graphic>
+          </wp:inline>
+        </w:drawing>
+      </w:r>
+    </w:p>
+    <w:p>
+      <w:pPr/>
+      <w:r>
+        <w:t xml:space="preserve">Fig. 7 · results/analysis_tradeoff.csv · risk-neutral GA, chance level 0.9</w:t>
+      </w:r>
+    </w:p>
+    <w:p>
+      <w:pPr/>
+      <w:r>
+        <w:t xml:space="preserve">Raising the target from 80 to 90 % costs about 0.24 USD/kg at both sites (0.025 USD/kg per percentage point); going from 95 to 99 % costs 1.22 (site A) and 1.67 USD/kg (site B), roughly 0.3–0.4 USD/kg per point — more than ten times steeper. The marginal kilogram near 100 % reliability is a mid-winter kilogram, and the GA buys it with storage that sits idle most of the year: the tank grows from 88–89 kg at 80 % to 685 kg (A) and 1 110 kg (B) at 99 %, while PV grows only 1.7-fold.</w:t>
+      </w:r>
+    </w:p>
+    <w:tbl>
+      <w:tblPr>
+        <w:tblStyle w:val="TableGrid"/>
+        <w:tblW w:w="0" w:type="auto"/>
+        <w:tblLayout w:type="fixed"/>
+        <w:tblLook w:val="04A0" w:firstRow="1" w:lastRow="0" w:firstColumn="0" w:lastColumn="0" w:noHBand="0" w:noVBand="1"/>
+      </w:tblPr>
+      <w:tblGrid>
+        <w:gridCol w:w="1872"/>
+        <w:gridCol w:w="1872"/>
+        <w:gridCol w:w="1872"/>
+        <w:gridCol w:w="1872"/>
+        <w:gridCol w:w="1872"/>
+      </w:tblGrid>
+      <w:tr>
+        <w:trPr>
+          <w:tblHeader/>
+        </w:trPr>
+        <w:tc>
+          <w:tcPr>
+            <w:tcW w:w="1872" w:type="dxa"/>
+            <w:shd w:val="clear" w:color="auto" w:fill="F2F2F2"/>
+          </w:tcPr>
+          <w:p>
+            <w:pPr/>
+            <w:r>
+              <w:t xml:space="preserve">Target</w:t>
+            </w:r>
+          </w:p>
+        </w:tc>
+        <w:tc>
+          <w:tcPr>
+            <w:tcW w:w="1872" w:type="dxa"/>
+            <w:shd w:val="clear" w:color="auto" w:fill="F2F2F2"/>
+          </w:tcPr>
+          <w:p>
+            <w:pPr/>
+            <w:r>
+              <w:t xml:space="preserve">Site A: PV / EL / battery / tank</w:t>
+            </w:r>
+          </w:p>
+        </w:tc>
+        <w:tc>
+          <w:tcPr>
+            <w:tcW w:w="1872" w:type="dxa"/>
+            <w:shd w:val="clear" w:color="auto" w:fill="F2F2F2"/>
+          </w:tcPr>
+          <w:p>
+            <w:pPr/>
+            <w:r>
+              <w:t xml:space="preserve">Site A: LCOH (USD/kg), compliant years</w:t>
+            </w:r>
+          </w:p>
+        </w:tc>
+        <w:tc>
+          <w:tcPr>
+            <w:tcW w:w="1872" w:type="dxa"/>
+            <w:shd w:val="clear" w:color="auto" w:fill="F2F2F2"/>
+          </w:tcPr>
+          <w:p>
+            <w:pPr/>
+            <w:r>
+              <w:t xml:space="preserve">Site B: PV / EL / battery / tank</w:t>
+            </w:r>
+          </w:p>
+        </w:tc>
+        <w:tc>
+          <w:tcPr>
+            <w:tcW w:w="1872" w:type="dxa"/>
+            <w:shd w:val="clear" w:color="auto" w:fill="F2F2F2"/>
+          </w:tcPr>
+          <w:p>
+            <w:pPr/>
+            <w:r>
+              <w:t xml:space="preserve">Site B: LCOH (USD/kg), compliant years</w:t>
+            </w:r>
+          </w:p>
+        </w:tc>
+      </w:tr>
+      <w:tr>
+        <w:tc>
+          <w:tcPr>
+            <w:tcW w:w="1872" w:type="dxa"/>
+          </w:tcPr>
+          <w:p>
+            <w:pPr/>
+            <w:r>
+              <w:t xml:space="preserve">80 %</w:t>
+            </w:r>
+          </w:p>
+        </w:tc>
+        <w:tc>
+          <w:tcPr>
+            <w:tcW w:w="1872" w:type="dxa"/>
+          </w:tcPr>
+          <w:p>
+            <w:pPr/>
+            <w:r>
+              <w:t xml:space="preserve">1 266 kWp / 652 kW / 38 kWh / 88 kg</w:t>
+            </w:r>
+          </w:p>
+        </w:tc>
+        <w:tc>
+          <w:tcPr>
+            <w:tcW w:w="1872" w:type="dxa"/>
+          </w:tcPr>
+          <w:p>
+            <w:pPr/>
+            <w:r>
+              <w:t xml:space="preserve">6.82, 100 %</w:t>
+            </w:r>
+          </w:p>
+        </w:tc>
+        <w:tc>
+          <w:tcPr>
+            <w:tcW w:w="1872" w:type="dxa"/>
+          </w:tcPr>
+          <w:p>
+            <w:pPr/>
+            <w:r>
+              <w:t xml:space="preserve">1 467 / 655 / 25 / 89</w:t>
+            </w:r>
+          </w:p>
+        </w:tc>
+        <w:tc>
+          <w:tcPr>
+            <w:tcW w:w="1872" w:type="dxa"/>
+          </w:tcPr>
+          <w:p>
+            <w:pPr/>
+            <w:r>
+              <w:t xml:space="preserve">7.23, 99 %</w:t>
+            </w:r>
+          </w:p>
+        </w:tc>
+      </w:tr>
+      <w:tr>
+        <w:tc>
+          <w:tcPr>
+            <w:tcW w:w="1872" w:type="dxa"/>
+          </w:tcPr>
+          <w:p>
+            <w:pPr/>
+            <w:r>
+              <w:t xml:space="preserve">90 %</w:t>
+            </w:r>
+          </w:p>
+        </w:tc>
+        <w:tc>
+          <w:tcPr>
+            <w:tcW w:w="1872" w:type="dxa"/>
+          </w:tcPr>
+          <w:p>
+            <w:pPr/>
+            <w:r>
+              <w:t xml:space="preserve">1 531 / 760 / 55 / 137</w:t>
+            </w:r>
+          </w:p>
+        </w:tc>
+        <w:tc>
+          <w:tcPr>
+            <w:tcW w:w="1872" w:type="dxa"/>
+          </w:tcPr>
+          <w:p>
+            <w:pPr/>
+            <w:r>
+              <w:t xml:space="preserve">7.06, 66 %</w:t>
+            </w:r>
+          </w:p>
+        </w:tc>
+        <w:tc>
+          <w:tcPr>
+            <w:tcW w:w="1872" w:type="dxa"/>
+          </w:tcPr>
+          <w:p>
+            <w:pPr/>
+            <w:r>
+              <w:t xml:space="preserve">1 799 / 764 / 14 / 140</w:t>
+            </w:r>
+          </w:p>
+        </w:tc>
+        <w:tc>
+          <w:tcPr>
+            <w:tcW w:w="1872" w:type="dxa"/>
+          </w:tcPr>
+          <w:p>
+            <w:pPr/>
+            <w:r>
+              <w:t xml:space="preserve">7.46, 90 %</w:t>
+            </w:r>
+          </w:p>
+        </w:tc>
+      </w:tr>
+      <w:tr>
+        <w:tc>
+          <w:tcPr>
+            <w:tcW w:w="1872" w:type="dxa"/>
+          </w:tcPr>
+          <w:p>
+            <w:pPr/>
+            <w:r>
+              <w:t xml:space="preserve">95 %</w:t>
+            </w:r>
+          </w:p>
+        </w:tc>
+        <w:tc>
+          <w:tcPr>
+            <w:tcW w:w="1872" w:type="dxa"/>
+          </w:tcPr>
+          <w:p>
+            <w:pPr/>
+            <w:r>
+              <w:t xml:space="preserve">1 780 / 906 / 73 / 224</w:t>
+            </w:r>
+          </w:p>
+        </w:tc>
+        <w:tc>
+          <w:tcPr>
+            <w:tcW w:w="1872" w:type="dxa"/>
+          </w:tcPr>
+          <w:p>
+            <w:pPr/>
+            <w:r>
+              <w:t xml:space="preserve">7.77, 49 %</w:t>
+            </w:r>
+          </w:p>
+        </w:tc>
+        <w:tc>
+          <w:tcPr>
+            <w:tcW w:w="1872" w:type="dxa"/>
+          </w:tcPr>
+          <w:p>
+            <w:pPr/>
+            <w:r>
+              <w:t xml:space="preserve">2 061 / 866 / 59 / 257</w:t>
+            </w:r>
+          </w:p>
+        </w:tc>
+        <w:tc>
+          <w:tcPr>
+            <w:tcW w:w="1872" w:type="dxa"/>
+          </w:tcPr>
+          <w:p>
+            <w:pPr/>
+            <w:r>
+              <w:t xml:space="preserve">8.10, 78 %</w:t>
+            </w:r>
+          </w:p>
+        </w:tc>
+      </w:tr>
+      <w:tr>
+        <w:tc>
+          <w:tcPr>
+            <w:tcW w:w="1872" w:type="dxa"/>
+          </w:tcPr>
+          <w:p>
+            <w:pPr/>
+            <w:r>
+              <w:t xml:space="preserve">97 %</w:t>
+            </w:r>
+          </w:p>
+        </w:tc>
+        <w:tc>
+          <w:tcPr>
+            <w:tcW w:w="1872" w:type="dxa"/>
+          </w:tcPr>
+          <w:p>
+            <w:pPr/>
+            <w:r>
+              <w:t xml:space="preserve">2 038 / 944 / 37 / 292</w:t>
+            </w:r>
+          </w:p>
+        </w:tc>
+        <w:tc>
+          <w:tcPr>
+            <w:tcW w:w="1872" w:type="dxa"/>
+          </w:tcPr>
+          <w:p>
+            <w:pPr/>
+            <w:r>
+              <w:t xml:space="preserve">8.28, 41 %</w:t>
+            </w:r>
+          </w:p>
+        </w:tc>
+        <w:tc>
+          <w:tcPr>
+            <w:tcW w:w="1872" w:type="dxa"/>
+          </w:tcPr>
+          <w:p>
+            <w:pPr/>
+            <w:r>
+              <w:t xml:space="preserve">2 336 / 921 / 49 / 321</w:t>
+            </w:r>
+          </w:p>
+        </w:tc>
+        <w:tc>
+          <w:tcPr>
+            <w:tcW w:w="1872" w:type="dxa"/>
+          </w:tcPr>
+          <w:p>
+            <w:pPr/>
+            <w:r>
+              <w:t xml:space="preserve">8.69, 86 %</w:t>
+            </w:r>
+          </w:p>
+        </w:tc>
+      </w:tr>
+      <w:tr>
+        <w:tc>
+          <w:tcPr>
+            <w:tcW w:w="1872" w:type="dxa"/>
+          </w:tcPr>
+          <w:p>
+            <w:pPr/>
+            <w:r>
+              <w:t xml:space="preserve">99 %</w:t>
+            </w:r>
+          </w:p>
+        </w:tc>
+        <w:tc>
+          <w:tcPr>
+            <w:tcW w:w="1872" w:type="dxa"/>
+          </w:tcPr>
+          <w:p>
+            <w:pPr/>
+            <w:r>
+              <w:t xml:space="preserve">2 113 / 979 / 95 / 685</w:t>
+            </w:r>
+          </w:p>
+        </w:tc>
+        <w:tc>
+          <w:tcPr>
+            <w:tcW w:w="1872" w:type="dxa"/>
+          </w:tcPr>
+          <w:p>
+            <w:pPr/>
+            <w:r>
+              <w:t xml:space="preserve">8.99, 14 %</w:t>
+            </w:r>
+          </w:p>
+        </w:tc>
+        <w:tc>
+          <w:tcPr>
+            <w:tcW w:w="1872" w:type="dxa"/>
+          </w:tcPr>
+          <w:p>
+            <w:pPr/>
+            <w:r>
+              <w:t xml:space="preserve">2 366 / 940 / 131 / 1 110</w:t>
+            </w:r>
+          </w:p>
+        </w:tc>
+        <w:tc>
+          <w:tcPr>
+            <w:tcW w:w="1872" w:type="dxa"/>
+          </w:tcPr>
+          <w:p>
+            <w:pPr/>
+            <w:r>
+              <w:t xml:space="preserve">9.77, 91 %</w:t>
+            </w:r>
+          </w:p>
+        </w:tc>
+      </w:tr>
+    </w:tbl>
+    <w:p>
+      <w:pPr/>
+      <w:r>
+        <w:t xml:space="preserve">Compliance is measured on bootstrap years against each design's own target. At site B every design reaches 78–99 % compliance, near the 90 % chance level it was built for. At site A compliance falls steadily as the target tightens (100 % → 14 %): the stricter the target, the more the design depends on the lower tail of winter weather — exactly where the CVAE is too mild at site A (Section 7.3). The trade-off curve thus doubles as a diagnostic of generator quality: when out-of-sample compliance collapses at high targets, the generator's tail needs attention before the design can be trusted.</w:t>
+      </w:r>
+    </w:p>
+    <w:p>
+      <w:pPr>
+        <w:pStyle w:val="Heading3"/>
+      </w:pPr>
+      <w:r>
+        <w:t xml:space="preserve">7.8 Robustness of the GA and scenario-count convergence</w:t>
+      </w:r>
+    </w:p>
+    <w:p>
+      <w:pPr/>
+      <w:r>
+        <w:t xml:space="preserve">The GA returns the same cost to within 0.04 % across seeds, and 30 scenarios estimate expected LCOH precisely; the weak point is the chance constraint, whose estimate from 30 scenarios carries a standard error of 5–7 percentage points.</w:t>
+      </w:r>
+    </w:p>
+    <w:p>
+      <w:pPr/>
+      <w:r>
+        <w:rPr>
+          <w:b/>
+        </w:rPr>
+        <w:t xml:space="preserve">Seed robustness.</w:t>
+      </w:r>
+      <w:r>
+        <w:t xml:space="preserve"> The risk-neutral problem was solved with five further random seeds per site (population 40, 60 generations each).</w:t>
+      </w:r>
+    </w:p>
+    <w:tbl>
+      <w:tblPr>
+        <w:tblStyle w:val="TableGrid"/>
+        <w:tblW w:w="0" w:type="auto"/>
+        <w:tblLayout w:type="fixed"/>
+        <w:tblLook w:val="04A0" w:firstRow="1" w:lastRow="0" w:firstColumn="0" w:lastColumn="0" w:noHBand="0" w:noVBand="1"/>
+      </w:tblPr>
+      <w:tblGrid>
+        <w:gridCol w:w="1560"/>
+        <w:gridCol w:w="1560"/>
+        <w:gridCol w:w="1560"/>
+        <w:gridCol w:w="1560"/>
+        <w:gridCol w:w="1560"/>
+        <w:gridCol w:w="1560"/>
+      </w:tblGrid>
+      <w:tr>
+        <w:trPr>
+          <w:tblHeader/>
+        </w:trPr>
+        <w:tc>
+          <w:tcPr>
+            <w:tcW w:w="1560" w:type="dxa"/>
+            <w:shd w:val="clear" w:color="auto" w:fill="F2F2F2"/>
+          </w:tcPr>
+          <w:p>
+            <w:pPr/>
+            <w:r>
+              <w:t xml:space="preserve">Site</w:t>
+            </w:r>
+          </w:p>
+        </w:tc>
+        <w:tc>
+          <w:tcPr>
+            <w:tcW w:w="1560" w:type="dxa"/>
+            <w:shd w:val="clear" w:color="auto" w:fill="F2F2F2"/>
+          </w:tcPr>
+          <w:p>
+            <w:pPr/>
+            <w:r>
+              <w:t xml:space="preserve">Objective (USD/kg), mean ± SD</w:t>
+            </w:r>
+          </w:p>
+        </w:tc>
+        <w:tc>
+          <w:tcPr>
+            <w:tcW w:w="1560" w:type="dxa"/>
+            <w:shd w:val="clear" w:color="auto" w:fill="F2F2F2"/>
+          </w:tcPr>
+          <w:p>
+            <w:pPr/>
+            <w:r>
+              <w:t xml:space="preserve">PV (kWp) mean ± SD (CV)</w:t>
+            </w:r>
+          </w:p>
+        </w:tc>
+        <w:tc>
+          <w:tcPr>
+            <w:tcW w:w="1560" w:type="dxa"/>
+            <w:shd w:val="clear" w:color="auto" w:fill="F2F2F2"/>
+          </w:tcPr>
+          <w:p>
+            <w:pPr/>
+            <w:r>
+              <w:t xml:space="preserve">Electrolyser (kW)</w:t>
+            </w:r>
+          </w:p>
+        </w:tc>
+        <w:tc>
+          <w:tcPr>
+            <w:tcW w:w="1560" w:type="dxa"/>
+            <w:shd w:val="clear" w:color="auto" w:fill="F2F2F2"/>
+          </w:tcPr>
+          <w:p>
+            <w:pPr/>
+            <w:r>
+              <w:t xml:space="preserve">Battery (kWh)</w:t>
+            </w:r>
+          </w:p>
+        </w:tc>
+        <w:tc>
+          <w:tcPr>
+            <w:tcW w:w="1560" w:type="dxa"/>
+            <w:shd w:val="clear" w:color="auto" w:fill="F2F2F2"/>
+          </w:tcPr>
+          <w:p>
+            <w:pPr/>
+            <w:r>
+              <w:t xml:space="preserve">Tank (kg)</w:t>
+            </w:r>
+          </w:p>
+        </w:tc>
+      </w:tr>
+      <w:tr>
+        <w:tc>
+          <w:tcPr>
+            <w:tcW w:w="1560" w:type="dxa"/>
+          </w:tcPr>
+          <w:p>
+            <w:pPr/>
+            <w:r>
+              <w:t xml:space="preserve">A</w:t>
+            </w:r>
+          </w:p>
+        </w:tc>
+        <w:tc>
+          <w:tcPr>
+            <w:tcW w:w="1560" w:type="dxa"/>
+          </w:tcPr>
+          <w:p>
+            <w:pPr/>
+            <w:r>
+              <w:t xml:space="preserve">7.630 ± 0.003</w:t>
+            </w:r>
+          </w:p>
+        </w:tc>
+        <w:tc>
+          <w:tcPr>
+            <w:tcW w:w="1560" w:type="dxa"/>
+          </w:tcPr>
+          <w:p>
+            <w:pPr/>
+            <w:r>
+              <w:t xml:space="preserve">1 820 ± 36 (2.0 %)</w:t>
+            </w:r>
+          </w:p>
+        </w:tc>
+        <w:tc>
+          <w:tcPr>
+            <w:tcW w:w="1560" w:type="dxa"/>
+          </w:tcPr>
+          <w:p>
+            <w:pPr/>
+            <w:r>
+              <w:t xml:space="preserve">888 ± 10 (1.2 %)</w:t>
+            </w:r>
+          </w:p>
+        </w:tc>
+        <w:tc>
+          <w:tcPr>
+            <w:tcW w:w="1560" w:type="dxa"/>
+          </w:tcPr>
+          <w:p>
+            <w:pPr/>
+            <w:r>
+              <w:t xml:space="preserve">81 ± 32 (40 %)</w:t>
+            </w:r>
+          </w:p>
+        </w:tc>
+        <w:tc>
+          <w:tcPr>
+            <w:tcW w:w="1560" w:type="dxa"/>
+          </w:tcPr>
+          <w:p>
+            <w:pPr/>
+            <w:r>
+              <w:t xml:space="preserve">209 ± 8 (3.6 %)</w:t>
+            </w:r>
+          </w:p>
+        </w:tc>
+      </w:tr>
+      <w:tr>
+        <w:tc>
+          <w:tcPr>
+            <w:tcW w:w="1560" w:type="dxa"/>
+          </w:tcPr>
+          <w:p>
+            <w:pPr/>
+            <w:r>
+              <w:t xml:space="preserve">B</w:t>
+            </w:r>
+          </w:p>
+        </w:tc>
+        <w:tc>
+          <w:tcPr>
+            <w:tcW w:w="1560" w:type="dxa"/>
+          </w:tcPr>
+          <w:p>
+            <w:pPr/>
+            <w:r>
+              <w:t xml:space="preserve">8.071 ± 0.002</w:t>
+            </w:r>
+          </w:p>
+        </w:tc>
+        <w:tc>
+          <w:tcPr>
+            <w:tcW w:w="1560" w:type="dxa"/>
+          </w:tcPr>
+          <w:p>
+            <w:pPr/>
+            <w:r>
+              <w:t xml:space="preserve">2 095 ± 28 (1.3 %)</w:t>
+            </w:r>
+          </w:p>
+        </w:tc>
+        <w:tc>
+          <w:tcPr>
+            <w:tcW w:w="1560" w:type="dxa"/>
+          </w:tcPr>
+          <w:p>
+            <w:pPr/>
+            <w:r>
+              <w:t xml:space="preserve">855 ± 12 (1.5 %)</w:t>
+            </w:r>
+          </w:p>
+        </w:tc>
+        <w:tc>
+          <w:tcPr>
+            <w:tcW w:w="1560" w:type="dxa"/>
+          </w:tcPr>
+          <w:p>
+            <w:pPr/>
+            <w:r>
+              <w:t xml:space="preserve">66 ± 18 (27 %)</w:t>
+            </w:r>
+          </w:p>
+        </w:tc>
+        <w:tc>
+          <w:tcPr>
+            <w:tcW w:w="1560" w:type="dxa"/>
+          </w:tcPr>
+          <w:p>
+            <w:pPr/>
+            <w:r>
+              <w:t xml:space="preserve">229 ± 14 (5.9 %)</w:t>
+            </w:r>
+          </w:p>
+        </w:tc>
+      </w:tr>
+    </w:tbl>
+    <w:p>
+      <w:pPr/>
+      <w:r>
+        <w:t xml:space="preserve">PV, electrolyser and tank sizes are reproducible to within 1–6 %. The battery varies by 27–40 % between seeds while the objective does not move, which shows a flat direction in the cost landscape: within 30–110 kWh the battery hardly matters (Section 6.4). Reporting such flat directions matters for practice — the battery size here is a free engineering choice, not an optimisation result.</w:t>
+      </w:r>
+    </w:p>
+    <w:p>
+      <w:pPr/>
+      <w:r>
+        <w:rPr>
+          <w:b/>
+        </w:rPr>
+        <w:t xml:space="preserve">Scenario count (sample-average approximation).</w:t>
+      </w:r>
+      <w:r>
+        <w:t xml:space="preserve"> Subsets of S CVAE years were drawn 1 000 times from the 200-year set, and the standard error (SE) of the two quantities the optimiser estimates was measured for the risk-neutral design.</w:t>
+      </w:r>
+    </w:p>
+    <w:tbl>
+      <w:tblPr>
+        <w:tblStyle w:val="TableGrid"/>
+        <w:tblW w:w="0" w:type="auto"/>
+        <w:tblLayout w:type="fixed"/>
+        <w:tblLook w:val="04A0" w:firstRow="1" w:lastRow="0" w:firstColumn="0" w:lastColumn="0" w:noHBand="0" w:noVBand="1"/>
+      </w:tblPr>
+      <w:tblGrid>
+        <w:gridCol w:w="3120"/>
+        <w:gridCol w:w="3120"/>
+        <w:gridCol w:w="3120"/>
+      </w:tblGrid>
+      <w:tr>
+        <w:trPr>
+          <w:tblHeader/>
+        </w:trPr>
+        <w:tc>
+          <w:tcPr>
+            <w:tcW w:w="3120" w:type="dxa"/>
+            <w:shd w:val="clear" w:color="auto" w:fill="F2F2F2"/>
+          </w:tcPr>
+          <w:p>
+            <w:pPr/>
+            <w:r>
+              <w:t xml:space="preserve">Scenarios S</w:t>
+            </w:r>
+          </w:p>
+        </w:tc>
+        <w:tc>
+          <w:tcPr>
+            <w:tcW w:w="3120" w:type="dxa"/>
+            <w:shd w:val="clear" w:color="auto" w:fill="F2F2F2"/>
+          </w:tcPr>
+          <w:p>
+            <w:pPr/>
+            <w:r>
+              <w:t xml:space="preserve">SE of mean LCOH, site A / B (USD/kg)</w:t>
+            </w:r>
+          </w:p>
+        </w:tc>
+        <w:tc>
+          <w:tcPr>
+            <w:tcW w:w="3120" w:type="dxa"/>
+            <w:shd w:val="clear" w:color="auto" w:fill="F2F2F2"/>
+          </w:tcPr>
+          <w:p>
+            <w:pPr/>
+            <w:r>
+              <w:t xml:space="preserve">SE of compliance share, site A / B (percentage points)</w:t>
+            </w:r>
+          </w:p>
+        </w:tc>
+      </w:tr>
+      <w:tr>
+        <w:tc>
+          <w:tcPr>
+            <w:tcW w:w="3120" w:type="dxa"/>
+          </w:tcPr>
+          <w:p>
+            <w:pPr/>
+            <w:r>
+              <w:t xml:space="preserve">5</w:t>
+            </w:r>
+          </w:p>
+        </w:tc>
+        <w:tc>
+          <w:tcPr>
+            <w:tcW w:w="3120" w:type="dxa"/>
+          </w:tcPr>
+          <w:p>
+            <w:pPr/>
+            <w:r>
+              <w:t xml:space="preserve">0.050 / 0.045</w:t>
+            </w:r>
+          </w:p>
+        </w:tc>
+        <w:tc>
+          <w:tcPr>
+            <w:tcW w:w="3120" w:type="dxa"/>
+          </w:tcPr>
+          <w:p>
+            <w:pPr/>
+            <w:r>
+              <w:t xml:space="preserve">13.4 / 17.8</w:t>
+            </w:r>
+          </w:p>
+        </w:tc>
+      </w:tr>
+      <w:tr>
+        <w:tc>
+          <w:tcPr>
+            <w:tcW w:w="3120" w:type="dxa"/>
+          </w:tcPr>
+          <w:p>
+            <w:pPr/>
+            <w:r>
+              <w:t xml:space="preserve">10</w:t>
+            </w:r>
+          </w:p>
+        </w:tc>
+        <w:tc>
+          <w:tcPr>
+            <w:tcW w:w="3120" w:type="dxa"/>
+          </w:tcPr>
+          <w:p>
+            <w:pPr/>
+            <w:r>
+              <w:t xml:space="preserve">0.035 / 0.032</w:t>
+            </w:r>
+          </w:p>
+        </w:tc>
+        <w:tc>
+          <w:tcPr>
+            <w:tcW w:w="3120" w:type="dxa"/>
+          </w:tcPr>
+          <w:p>
+            <w:pPr/>
+            <w:r>
+              <w:t xml:space="preserve">9.2 / 12.6</w:t>
+            </w:r>
+          </w:p>
+        </w:tc>
+      </w:tr>
+      <w:tr>
+        <w:tc>
+          <w:tcPr>
+            <w:tcW w:w="3120" w:type="dxa"/>
+          </w:tcPr>
+          <w:p>
+            <w:pPr/>
+            <w:r>
+              <w:t xml:space="preserve">20</w:t>
+            </w:r>
+          </w:p>
+        </w:tc>
+        <w:tc>
+          <w:tcPr>
+            <w:tcW w:w="3120" w:type="dxa"/>
+          </w:tcPr>
+          <w:p>
+            <w:pPr/>
+            <w:r>
+              <w:t xml:space="preserve">0.024 / 0.022</w:t>
+            </w:r>
+          </w:p>
+        </w:tc>
+        <w:tc>
+          <w:tcPr>
+            <w:tcW w:w="3120" w:type="dxa"/>
+          </w:tcPr>
+          <w:p>
+            <w:pPr/>
+            <w:r>
+              <w:t xml:space="preserve">6.6 / 8.7</w:t>
+            </w:r>
+          </w:p>
+        </w:tc>
+      </w:tr>
+      <w:tr>
+        <w:tc>
+          <w:tcPr>
+            <w:tcW w:w="3120" w:type="dxa"/>
+          </w:tcPr>
+          <w:p>
+            <w:pPr/>
+            <w:r>
+              <w:rPr>
+                <w:b/>
+              </w:rPr>
+              <w:t xml:space="preserve">30 (used)</w:t>
+            </w:r>
+          </w:p>
+        </w:tc>
+        <w:tc>
+          <w:tcPr>
+            <w:tcW w:w="3120" w:type="dxa"/>
+          </w:tcPr>
+          <w:p>
+            <w:pPr/>
+            <w:r>
+              <w:rPr>
+                <w:b/>
+              </w:rPr>
+              <w:t xml:space="preserve">0.018 / 0.017</w:t>
+            </w:r>
+          </w:p>
+        </w:tc>
+        <w:tc>
+          <w:tcPr>
+            <w:tcW w:w="3120" w:type="dxa"/>
+          </w:tcPr>
+          <w:p>
+            <w:pPr/>
+            <w:r>
+              <w:rPr>
+                <w:b/>
+              </w:rPr>
+              <w:t xml:space="preserve">5.1 / 6.9</w:t>
+            </w:r>
+          </w:p>
+        </w:tc>
+      </w:tr>
+      <w:tr>
+        <w:tc>
+          <w:tcPr>
+            <w:tcW w:w="3120" w:type="dxa"/>
+          </w:tcPr>
+          <w:p>
+            <w:pPr/>
+            <w:r>
+              <w:t xml:space="preserve">50</w:t>
+            </w:r>
+          </w:p>
+        </w:tc>
+        <w:tc>
+          <w:tcPr>
+            <w:tcW w:w="3120" w:type="dxa"/>
+          </w:tcPr>
+          <w:p>
+            <w:pPr/>
+            <w:r>
+              <w:t xml:space="preserve">0.013 / 0.012</w:t>
+            </w:r>
+          </w:p>
+        </w:tc>
+        <w:tc>
+          <w:tcPr>
+            <w:tcW w:w="3120" w:type="dxa"/>
+          </w:tcPr>
+          <w:p>
+            <w:pPr/>
+            <w:r>
+              <w:t xml:space="preserve">3.8 / 4.8</w:t>
+            </w:r>
+          </w:p>
+        </w:tc>
+      </w:tr>
+      <w:tr>
+        <w:tc>
+          <w:tcPr>
+            <w:tcW w:w="3120" w:type="dxa"/>
+          </w:tcPr>
+          <w:p>
+            <w:pPr/>
+            <w:r>
+              <w:t xml:space="preserve">100</w:t>
+            </w:r>
+          </w:p>
+        </w:tc>
+        <w:tc>
+          <w:tcPr>
+            <w:tcW w:w="3120" w:type="dxa"/>
+          </w:tcPr>
+          <w:p>
+            <w:pPr/>
+            <w:r>
+              <w:t xml:space="preserve">0.008 / 0.007</w:t>
+            </w:r>
+          </w:p>
+        </w:tc>
+        <w:tc>
+          <w:tcPr>
+            <w:tcW w:w="3120" w:type="dxa"/>
+          </w:tcPr>
+          <w:p>
+            <w:pPr/>
+            <w:r>
+              <w:t xml:space="preserve">2.2 / 2.8</w:t>
+            </w:r>
+          </w:p>
+        </w:tc>
+      </w:tr>
+    </w:tbl>
+    <w:p>
+      <w:pPr/>
+      <w:r>
+        <w:t xml:space="preserve">Both errors fall as 1/√S, as theory predicts. With 30 scenarios, the expected LCOH is known to ±0.2 %, far finer than any cost difference that matters. The compliance share, however, is uncertain by about ±6 points, so a design can satisfy "90 % of scenarios" in-sample by luck. This sampling noise, together with the generator's tail bias, explains why in-sample compliance (0.90) did not carry over to bootstrap years at site A. Practical guidance: use at least 100 scenarios when a chance constraint is binding, or add a safety margin of two standard errors to the chance level.</w:t>
+      </w:r>
+    </w:p>
+    <w:p>
+      <w:pPr>
+        <w:pStyle w:val="Heading2"/>
+      </w:pPr>
+      <w:r>
+        <w:t xml:space="preserve">8 Discussion: Operational Trends and Technical Challenges</w:t>
       </w:r>
     </w:p>
     <w:p>
@@ -3190,7 +7923,7 @@
         <w:t xml:space="preserve">Validate the generator against real data, in the units that matter.</w:t>
       </w:r>
       <w:r>
-        <w:t xml:space="preserve"> The CVAE won on forecast scores, yet at the arid site it slightly under-produced long overcast spells, and the design inherited that optimism. Generic scores (energy score, CRPS) are necessary but not sufficient; a generator for storage sizing must also be checked on persistence statistics such as run lengths of low-irradiance days. A practical safeguard, used here, is to referee every design on bootstrap years built from real days.</w:t>
+        <w:t xml:space="preserve"> The CVAE tied the baselines on forecast scores and beat them on calibration and persistence, yet at the arid site its daily lower tail was slightly too mild, and the design inherited that optimism (Sections 7.3 and 7.7). Generic scores (energy score, CRPS) are necessary but not sufficient; a generator for storage sizing must also be checked on persistence statistics such as run lengths of low-irradiance days. A practical safeguard, used here, is to referee every design on bootstrap years built from real days.</w:t>
       </w:r>
     </w:p>
     <w:p>
@@ -3258,13 +7991,13 @@
         <w:pStyle w:val="Heading2"/>
       </w:pPr>
       <w:r>
-        <w:t xml:space="preserve">8 Conclusion</w:t>
-      </w:r>
-    </w:p>
-    <w:p>
-      <w:pPr/>
-      <w:r>
-        <w:t xml:space="preserve">This chapter linked a physics-informed conditional VAE to genetic-algorithm sizing of an off-grid solar hydrogen plant, using open NREL data for a semi-arid and a humid site. The CVAE, written from scratch in NumPy and trained in 30 s, matched or beat Gaussian, bootstrap and climatology baselines and gave the best-calibrated intervals. Designs optimised on generated weather years kept 95 % supply reliability in 49–78 % of unseen real-weather years, against 32–42 % for designs sized on one historical year, at an LCOH cost of 1–2.5 % (7.8–8.1 USD/kg at 100 kg/day). The GA outperformed random search by 0.3–0.9 USD/kg at equal budget, and showed that compressed-hydrogen storage, not batteries, should buffer a constant off-take. The main caution is that a generator's tail behaviour flows straight into the design, so generators for storage sizing should be validated on persistence statistics against real data. Code and data accompany the chapter so that every number can be reproduced.</w:t>
+        <w:t xml:space="preserve">9 Conclusion</w:t>
+      </w:r>
+    </w:p>
+    <w:p>
+      <w:pPr/>
+      <w:r>
+        <w:t xml:space="preserve">This chapter linked a physics-informed conditional VAE to genetic-algorithm sizing of an off-grid solar hydrogen plant, using open NREL data for a semi-arid and a humid site. The CVAE, written from scratch in NumPy and trained in 30 s, was statistically indistinguishable from Gaussian and bootstrap baselines on forecast scores, but it was the only generator with calibrated intervals at both sites (PIT χ² p = 0.56 and 0.92) and the only one to reproduce observed day-to-day persistence (lag-1 autocorrelation 0.29 vs 0.28). Designs optimised on generated weather years kept 95 % supply reliability in 49–78 % of unseen real-weather years, against 32–42 % for designs sized on one historical year, at an LCOH cost of 1–2.5 % (7.8–8.1 USD/kg at 100 kg/day). The GA outperformed random search by 0.3–0.9 USD/kg at equal budget, and showed that compressed-hydrogen storage, not batteries, should buffer a constant off-take. The statistical analysis adds four lessons: the reliability gain of stochastic design is overwhelmingly significant (McNemar p &lt; 10⁻⁹, no year favouring the deterministic design); 97–99 % of shortfall falls in November–February, so annual reliability targets hide a mid-winter gap; electrolyser cost, discount rate and PV cost explain 99 % of LCOH variance while weather explains under 1 %; and 30 scenarios estimate cost to ±0.2 % but a chance constraint only to ±6 points, so at least 100 scenarios are advisable when reliability is binding. The main caution is that a generator's tail behaviour flows straight into the design, so generators for storage sizing should be validated on persistence and extreme-spell statistics against real data. Code and data accompany the chapter so that every number can be reproduced.</w:t>
       </w:r>
     </w:p>
     <w:p>
@@ -3278,7 +8011,7 @@
       <w:r>
         <w:t xml:space="preserve"> All code, the processed datasets (CSV and Excel) and the result files are in the </w:t>
       </w:r>
-      <w:hyperlink r:id="rId7" w:history="1">
+      <w:hyperlink r:id="rId11" w:history="1">
         <w:r>
           <w:rPr>
             <w:rStyle w:val="Hyperlink"/>

</xml_diff>